<commit_message>
Mover barrido de rho a src, fijar rho = 0,65 (D-13), glosario e informe actualizados
Co-Authored-By: Claude Opus 5.5 (1M context) <noreply@anthropic.com>
</commit_message>
<xml_diff>
--- a/docs/Informe_avance_TFI.docx
+++ b/docs/Informe_avance_TFI.docx
@@ -210,7 +210,7 @@
         <w:spacing w:after="120"/>
       </w:pPr>
       <w:r>
-        <w:t xml:space="preserve">Este informe resume el trabajo del 27/10/2026: decisiones de diseño (D-01 a D-12, detalladas en </w:t>
+        <w:t xml:space="preserve">Este informe resume el trabajo del 27/10/2026: decisiones de diseño (D-01 a D-13, detalladas en </w:t>
       </w:r>
       <w:r>
         <w:rPr>
@@ -4053,23 +4053,203 @@
         <w:pStyle w:val="Heading2"/>
       </w:pPr>
       <w:r>
-        <w:t xml:space="preserve">6.3 Barrido de ρ (ISSUE-103)</w:t>
+        <w:rPr/>
+        <w:t>6.3 Barrido de ρ y elección del valor final (ISSUE-103, D-13)</w:t>
       </w:r>
     </w:p>
     <w:p>
       <w:pPr>
         <w:spacing w:after="120"/>
       </w:pPr>
+      <w:r>
+        <w:rPr>
+          <w:b/>
+          <w:sz w:val="20"/>
+          <w:szCs w:val="20"/>
+        </w:rPr>
+        <w:t xml:space="preserve">Cómo se probó. </w:t>
+      </w:r>
       <w:r>
         <w:rPr>
           <w:rFonts w:ascii="Consolas" w:cs="Consolas" w:eastAsia="Consolas" w:hAnsi="Consolas"/>
           <w:sz w:val="20"/>
           <w:szCs w:val="20"/>
         </w:rPr>
-        <w:t xml:space="preserve">scripts/barrido_rho_art1.py</w:t>
-      </w:r>
-      <w:r>
-        <w:t xml:space="preserve"> prueba ρ de 0,10 a 0,90. Pureza = proporción de alumnos cuyo nodo coincide con su clase EM; CR = nodos / alumnos; MAE en escala 0–10 y aciertos de categoría sobre el 20% reservado:</w:t>
+        <w:t>src/barrido_rho.py</w:t>
+      </w:r>
+      <w:r>
+        <w:rPr>
+          <w:sz w:val="20"/>
+          <w:szCs w:val="20"/>
+        </w:rPr>
+        <w:t xml:space="preserve"> entrena la red con 17 valores de ρ, de 0,10 a 0,90 con paso 0,05. En cada prueba todo lo demás queda fijo: el EM con K = 4 da la categoría de cada alumno de entrenamiento, los alumnos se binarizan a 20 bits, ART 1 se entrena con el 80% y después predice el 20% reservado sin modificar sus pesos. Para cada ρ se miden:</w:t>
+      </w:r>
+    </w:p>
+    <w:p>
+      <w:pPr>
+        <w:pStyle w:val="ListParagraph"/>
+        <w:numPr>
+          <w:ilvl w:val="0"/>
+          <w:numId w:val="2"/>
+        </w:numPr>
+        <w:spacing w:after="60"/>
+      </w:pPr>
+      <w:r>
+        <w:rPr>
+          <w:b/>
+          <w:bCs/>
+        </w:rPr>
+        <w:t xml:space="preserve">Nodos y CR: </w:t>
+      </w:r>
+      <w:r>
+        <w:rPr>
+          <w:bCs/>
+        </w:rPr>
+        <w:t>cantidad de grupos que creó la red y CR = nodos ÷ alumnos de entrenamiento. El documento de arquitectura pide CR entre 0,05 y 0,20 (entre 5 y 20 alumnos por nodo en promedio).</w:t>
+      </w:r>
+    </w:p>
+    <w:p>
+      <w:pPr>
+        <w:pStyle w:val="ListParagraph"/>
+        <w:numPr>
+          <w:ilvl w:val="0"/>
+          <w:numId w:val="2"/>
+        </w:numPr>
+        <w:spacing w:after="60"/>
+      </w:pPr>
+      <w:r>
+        <w:rPr>
+          <w:b/>
+          <w:bCs/>
+        </w:rPr>
+        <w:t xml:space="preserve">Pureza: </w:t>
+      </w:r>
+      <w:r>
+        <w:rPr>
+          <w:bCs/>
+        </w:rPr>
+        <w:t>qué tan homogéneo es cada nodo respecto de las categorías del EM (ver abajo). La meta es ≥ 80%.</w:t>
+      </w:r>
+    </w:p>
+    <w:p>
+      <w:pPr>
+        <w:pStyle w:val="ListParagraph"/>
+        <w:numPr>
+          <w:ilvl w:val="0"/>
+          <w:numId w:val="2"/>
+        </w:numPr>
+        <w:spacing w:after="60"/>
+      </w:pPr>
+      <w:r>
+        <w:rPr>
+          <w:b/>
+          <w:bCs/>
+        </w:rPr>
+        <w:t xml:space="preserve">MAE: </w:t>
+      </w:r>
+      <w:r>
+        <w:rPr>
+          <w:bCs/>
+        </w:rPr>
+        <w:t>error absoluto medio de la nota en escala 0–10 sobre los 2.000 alumnos no vistos, promedio de |nota real − nota esperada del nodo|.</w:t>
+      </w:r>
+    </w:p>
+    <w:p>
+      <w:pPr>
+        <w:pStyle w:val="ListParagraph"/>
+        <w:numPr>
+          <w:ilvl w:val="0"/>
+          <w:numId w:val="2"/>
+        </w:numPr>
+        <w:spacing w:after="60"/>
+      </w:pPr>
+      <w:r>
+        <w:rPr>
+          <w:b/>
+          <w:bCs/>
+        </w:rPr>
+        <w:t xml:space="preserve">Acierto de categoría: </w:t>
+      </w:r>
+      <w:r>
+        <w:rPr>
+          <w:bCs/>
+        </w:rPr>
+        <w:t>proporción de alumnos de prueba cuya categoría pronosticada coincide con la que sale de su nota real.</w:t>
+      </w:r>
+    </w:p>
+    <w:p>
+      <w:pPr>
+        <w:spacing w:after="120"/>
+      </w:pPr>
+      <w:r>
+        <w:rPr>
+          <w:b/>
+        </w:rPr>
+        <w:t xml:space="preserve">Cómo se calcula la pureza. </w:t>
+      </w:r>
+      <w:r>
+        <w:rPr/>
+        <w:t>Para cada nodo se busca la categoría EM más frecuente entre sus alumnos y se cuenta cuántos la tienen. Esos conteos se suman para todos los nodos y se dividen por el total de alumnos: Pureza = (1/N) · Σ</w:t>
+      </w:r>
+      <w:r>
+        <w:rPr>
+          <w:vertAlign w:val="subscript"/>
+        </w:rPr>
+        <w:t>j</w:t>
+      </w:r>
+      <w:r>
+        <w:rPr/>
+        <w:t xml:space="preserve"> máx</w:t>
+      </w:r>
+      <w:r>
+        <w:rPr>
+          <w:vertAlign w:val="subscript"/>
+        </w:rPr>
+        <w:t>c</w:t>
+      </w:r>
+      <w:r>
+        <w:rPr/>
+        <w:t xml:space="preserve"> |C</w:t>
+      </w:r>
+      <w:r>
+        <w:rPr>
+          <w:vertAlign w:val="subscript"/>
+        </w:rPr>
+        <w:t>j</w:t>
+      </w:r>
+      <w:r>
+        <w:rPr/>
+        <w:t xml:space="preserve"> ∩ L</w:t>
+      </w:r>
+      <w:r>
+        <w:rPr>
+          <w:vertAlign w:val="subscript"/>
+        </w:rPr>
+        <w:t>c</w:t>
+      </w:r>
+      <w:r>
+        <w:rPr/>
+        <w:t xml:space="preserve">|. Por ejemplo, un nodo con 10 alumnos, 8 de "Aprobado Regular" y 2 de "Recuperatorio", aporta 8; si todos los nodos fueran así, la pureza sería 80%. Está implementada en la función </w:t>
+      </w:r>
+      <w:r>
+        <w:rPr>
+          <w:rFonts w:ascii="Consolas" w:hAnsi="Consolas"/>
+        </w:rPr>
+        <w:t>pureza()</w:t>
+      </w:r>
+      <w:r>
+        <w:rPr/>
+        <w:t xml:space="preserve"> de </w:t>
+      </w:r>
+      <w:r>
+        <w:rPr>
+          <w:rFonts w:ascii="Consolas" w:hAnsi="Consolas"/>
+        </w:rPr>
+        <w:t>src/barrido_rho.py</w:t>
+      </w:r>
+      <w:r>
+        <w:rPr/>
+        <w:t>.</w:t>
       </w:r>
     </w:p>
     <w:tbl>
@@ -4085,13 +4265,12 @@
         </w:tblBorders>
       </w:tblPr>
       <w:tblGrid>
-        <w:gridCol w:w="900"/>
-        <w:gridCol w:w="1100"/>
-        <w:gridCol w:w="1000"/>
-        <w:gridCol w:w="1400"/>
-        <w:gridCol w:w="1500"/>
-        <w:gridCol w:w="1700"/>
-        <w:gridCol w:w="1426"/>
+        <w:gridCol w:w="1137"/>
+        <w:gridCol w:w="1337"/>
+        <w:gridCol w:w="1237"/>
+        <w:gridCol w:w="1637"/>
+        <w:gridCol w:w="1737"/>
+        <w:gridCol w:w="1937"/>
       </w:tblGrid>
       <w:tr>
         <w:trPr>
@@ -4099,7 +4278,7 @@
         </w:trPr>
         <w:tc>
           <w:tcPr>
-            <w:tcW w:type="dxa" w:w="900"/>
+            <w:tcW w:type="dxa" w:w="1137"/>
             <w:tcBorders>
               <w:top w:val="single" w:color="BBBBBB" w:sz="4"/>
               <w:left w:val="single" w:color="BBBBBB" w:sz="4"/>
@@ -4129,7 +4308,7 @@
         </w:tc>
         <w:tc>
           <w:tcPr>
-            <w:tcW w:type="dxa" w:w="1100"/>
+            <w:tcW w:type="dxa" w:w="1337"/>
             <w:tcBorders>
               <w:top w:val="single" w:color="BBBBBB" w:sz="4"/>
               <w:left w:val="single" w:color="BBBBBB" w:sz="4"/>
@@ -4159,7 +4338,7 @@
         </w:tc>
         <w:tc>
           <w:tcPr>
-            <w:tcW w:type="dxa" w:w="1000"/>
+            <w:tcW w:type="dxa" w:w="1237"/>
             <w:tcBorders>
               <w:top w:val="single" w:color="BBBBBB" w:sz="4"/>
               <w:left w:val="single" w:color="BBBBBB" w:sz="4"/>
@@ -4189,7 +4368,7 @@
         </w:tc>
         <w:tc>
           <w:tcPr>
-            <w:tcW w:type="dxa" w:w="1400"/>
+            <w:tcW w:type="dxa" w:w="1637"/>
             <w:tcBorders>
               <w:top w:val="single" w:color="BBBBBB" w:sz="4"/>
               <w:left w:val="single" w:color="BBBBBB" w:sz="4"/>
@@ -4219,7 +4398,7 @@
         </w:tc>
         <w:tc>
           <w:tcPr>
-            <w:tcW w:type="dxa" w:w="1500"/>
+            <w:tcW w:type="dxa" w:w="1737"/>
             <w:tcBorders>
               <w:top w:val="single" w:color="BBBBBB" w:sz="4"/>
               <w:left w:val="single" w:color="BBBBBB" w:sz="4"/>
@@ -4249,7 +4428,7 @@
         </w:tc>
         <w:tc>
           <w:tcPr>
-            <w:tcW w:type="dxa" w:w="1700"/>
+            <w:tcW w:type="dxa" w:w="1937"/>
             <w:tcBorders>
               <w:top w:val="single" w:color="BBBBBB" w:sz="4"/>
               <w:left w:val="single" w:color="BBBBBB" w:sz="4"/>
@@ -4277,36 +4456,6 @@
             </w:r>
           </w:p>
         </w:tc>
-        <w:tc>
-          <w:tcPr>
-            <w:tcW w:type="dxa" w:w="1426"/>
-            <w:tcBorders>
-              <w:top w:val="single" w:color="BBBBBB" w:sz="4"/>
-              <w:left w:val="single" w:color="BBBBBB" w:sz="4"/>
-              <w:bottom w:val="single" w:color="BBBBBB" w:sz="4"/>
-              <w:right w:val="single" w:color="BBBBBB" w:sz="4"/>
-            </w:tcBorders>
-            <w:shd w:fill="1F3864" w:color="auto" w:val="clear"/>
-            <w:tcMar>
-              <w:top w:type="dxa" w:w="50"/>
-              <w:left w:type="dxa" w:w="90"/>
-              <w:bottom w:type="dxa" w:w="50"/>
-              <w:right w:type="dxa" w:w="90"/>
-            </w:tcMar>
-          </w:tcPr>
-          <w:p>
-            <w:r>
-              <w:rPr>
-                <w:b/>
-                <w:bCs/>
-                <w:color w:val="FFFFFF"/>
-                <w:sz w:val="18"/>
-                <w:szCs w:val="18"/>
-              </w:rPr>
-              <w:t xml:space="preserve">Tiempo (s)</w:t>
-            </w:r>
-          </w:p>
-        </w:tc>
       </w:tr>
       <w:tr>
         <w:trPr>
@@ -4314,7 +4463,7 @@
         </w:trPr>
         <w:tc>
           <w:tcPr>
-            <w:tcW w:type="dxa" w:w="900"/>
+            <w:tcW w:type="dxa" w:w="1137"/>
             <w:tcBorders>
               <w:top w:val="single" w:color="BBBBBB" w:sz="4"/>
               <w:left w:val="single" w:color="BBBBBB" w:sz="4"/>
@@ -4336,7 +4485,7 @@
         </w:tc>
         <w:tc>
           <w:tcPr>
-            <w:tcW w:type="dxa" w:w="1100"/>
+            <w:tcW w:type="dxa" w:w="1337"/>
             <w:tcBorders>
               <w:top w:val="single" w:color="BBBBBB" w:sz="4"/>
               <w:left w:val="single" w:color="BBBBBB" w:sz="4"/>
@@ -4358,7 +4507,7 @@
         </w:tc>
         <w:tc>
           <w:tcPr>
-            <w:tcW w:type="dxa" w:w="1000"/>
+            <w:tcW w:type="dxa" w:w="1237"/>
             <w:tcBorders>
               <w:top w:val="single" w:color="BBBBBB" w:sz="4"/>
               <w:left w:val="single" w:color="BBBBBB" w:sz="4"/>
@@ -4380,7 +4529,7 @@
         </w:tc>
         <w:tc>
           <w:tcPr>
-            <w:tcW w:type="dxa" w:w="1400"/>
+            <w:tcW w:type="dxa" w:w="1637"/>
             <w:tcBorders>
               <w:top w:val="single" w:color="BBBBBB" w:sz="4"/>
               <w:left w:val="single" w:color="BBBBBB" w:sz="4"/>
@@ -4402,7 +4551,7 @@
         </w:tc>
         <w:tc>
           <w:tcPr>
-            <w:tcW w:type="dxa" w:w="1500"/>
+            <w:tcW w:type="dxa" w:w="1737"/>
             <w:tcBorders>
               <w:top w:val="single" w:color="BBBBBB" w:sz="4"/>
               <w:left w:val="single" w:color="BBBBBB" w:sz="4"/>
@@ -4424,7 +4573,7 @@
         </w:tc>
         <w:tc>
           <w:tcPr>
-            <w:tcW w:type="dxa" w:w="1700"/>
+            <w:tcW w:type="dxa" w:w="1937"/>
             <w:tcBorders>
               <w:top w:val="single" w:color="BBBBBB" w:sz="4"/>
               <w:left w:val="single" w:color="BBBBBB" w:sz="4"/>
@@ -4441,28 +4590,6 @@
           <w:p>
             <w:r>
               <w:t xml:space="preserve">47,0%</w:t>
-            </w:r>
-          </w:p>
-        </w:tc>
-        <w:tc>
-          <w:tcPr>
-            <w:tcW w:type="dxa" w:w="1426"/>
-            <w:tcBorders>
-              <w:top w:val="single" w:color="BBBBBB" w:sz="4"/>
-              <w:left w:val="single" w:color="BBBBBB" w:sz="4"/>
-              <w:bottom w:val="single" w:color="BBBBBB" w:sz="4"/>
-              <w:right w:val="single" w:color="BBBBBB" w:sz="4"/>
-            </w:tcBorders>
-            <w:tcMar>
-              <w:top w:type="dxa" w:w="50"/>
-              <w:left w:type="dxa" w:w="90"/>
-              <w:bottom w:type="dxa" w:w="50"/>
-              <w:right w:type="dxa" w:w="90"/>
-            </w:tcMar>
-          </w:tcPr>
-          <w:p>
-            <w:r>
-              <w:t xml:space="preserve">0,6</w:t>
             </w:r>
           </w:p>
         </w:tc>
@@ -4473,7 +4600,7 @@
         </w:trPr>
         <w:tc>
           <w:tcPr>
-            <w:tcW w:type="dxa" w:w="900"/>
+            <w:tcW w:type="dxa" w:w="1137"/>
             <w:tcBorders>
               <w:top w:val="single" w:color="BBBBBB" w:sz="4"/>
               <w:left w:val="single" w:color="BBBBBB" w:sz="4"/>
@@ -4495,7 +4622,7 @@
         </w:tc>
         <w:tc>
           <w:tcPr>
-            <w:tcW w:type="dxa" w:w="1100"/>
+            <w:tcW w:type="dxa" w:w="1337"/>
             <w:tcBorders>
               <w:top w:val="single" w:color="BBBBBB" w:sz="4"/>
               <w:left w:val="single" w:color="BBBBBB" w:sz="4"/>
@@ -4517,7 +4644,7 @@
         </w:tc>
         <w:tc>
           <w:tcPr>
-            <w:tcW w:type="dxa" w:w="1000"/>
+            <w:tcW w:type="dxa" w:w="1237"/>
             <w:tcBorders>
               <w:top w:val="single" w:color="BBBBBB" w:sz="4"/>
               <w:left w:val="single" w:color="BBBBBB" w:sz="4"/>
@@ -4539,7 +4666,7 @@
         </w:tc>
         <w:tc>
           <w:tcPr>
-            <w:tcW w:type="dxa" w:w="1400"/>
+            <w:tcW w:type="dxa" w:w="1637"/>
             <w:tcBorders>
               <w:top w:val="single" w:color="BBBBBB" w:sz="4"/>
               <w:left w:val="single" w:color="BBBBBB" w:sz="4"/>
@@ -4561,7 +4688,7 @@
         </w:tc>
         <w:tc>
           <w:tcPr>
-            <w:tcW w:type="dxa" w:w="1500"/>
+            <w:tcW w:type="dxa" w:w="1737"/>
             <w:tcBorders>
               <w:top w:val="single" w:color="BBBBBB" w:sz="4"/>
               <w:left w:val="single" w:color="BBBBBB" w:sz="4"/>
@@ -4583,7 +4710,7 @@
         </w:tc>
         <w:tc>
           <w:tcPr>
-            <w:tcW w:type="dxa" w:w="1700"/>
+            <w:tcW w:type="dxa" w:w="1937"/>
             <w:tcBorders>
               <w:top w:val="single" w:color="BBBBBB" w:sz="4"/>
               <w:left w:val="single" w:color="BBBBBB" w:sz="4"/>
@@ -4600,28 +4727,6 @@
           <w:p>
             <w:r>
               <w:t xml:space="preserve">46,4%</w:t>
-            </w:r>
-          </w:p>
-        </w:tc>
-        <w:tc>
-          <w:tcPr>
-            <w:tcW w:type="dxa" w:w="1426"/>
-            <w:tcBorders>
-              <w:top w:val="single" w:color="BBBBBB" w:sz="4"/>
-              <w:left w:val="single" w:color="BBBBBB" w:sz="4"/>
-              <w:bottom w:val="single" w:color="BBBBBB" w:sz="4"/>
-              <w:right w:val="single" w:color="BBBBBB" w:sz="4"/>
-            </w:tcBorders>
-            <w:tcMar>
-              <w:top w:type="dxa" w:w="50"/>
-              <w:left w:type="dxa" w:w="90"/>
-              <w:bottom w:type="dxa" w:w="50"/>
-              <w:right w:type="dxa" w:w="90"/>
-            </w:tcMar>
-          </w:tcPr>
-          <w:p>
-            <w:r>
-              <w:t xml:space="preserve">1,5</w:t>
             </w:r>
           </w:p>
         </w:tc>
@@ -4632,7 +4737,7 @@
         </w:trPr>
         <w:tc>
           <w:tcPr>
-            <w:tcW w:type="dxa" w:w="900"/>
+            <w:tcW w:type="dxa" w:w="1137"/>
             <w:tcBorders>
               <w:top w:val="single" w:color="BBBBBB" w:sz="4"/>
               <w:left w:val="single" w:color="BBBBBB" w:sz="4"/>
@@ -4654,7 +4759,7 @@
         </w:tc>
         <w:tc>
           <w:tcPr>
-            <w:tcW w:type="dxa" w:w="1100"/>
+            <w:tcW w:type="dxa" w:w="1337"/>
             <w:tcBorders>
               <w:top w:val="single" w:color="BBBBBB" w:sz="4"/>
               <w:left w:val="single" w:color="BBBBBB" w:sz="4"/>
@@ -4676,7 +4781,7 @@
         </w:tc>
         <w:tc>
           <w:tcPr>
-            <w:tcW w:type="dxa" w:w="1000"/>
+            <w:tcW w:type="dxa" w:w="1237"/>
             <w:tcBorders>
               <w:top w:val="single" w:color="BBBBBB" w:sz="4"/>
               <w:left w:val="single" w:color="BBBBBB" w:sz="4"/>
@@ -4698,7 +4803,7 @@
         </w:tc>
         <w:tc>
           <w:tcPr>
-            <w:tcW w:type="dxa" w:w="1400"/>
+            <w:tcW w:type="dxa" w:w="1637"/>
             <w:tcBorders>
               <w:top w:val="single" w:color="BBBBBB" w:sz="4"/>
               <w:left w:val="single" w:color="BBBBBB" w:sz="4"/>
@@ -4720,7 +4825,7 @@
         </w:tc>
         <w:tc>
           <w:tcPr>
-            <w:tcW w:type="dxa" w:w="1500"/>
+            <w:tcW w:type="dxa" w:w="1737"/>
             <w:tcBorders>
               <w:top w:val="single" w:color="BBBBBB" w:sz="4"/>
               <w:left w:val="single" w:color="BBBBBB" w:sz="4"/>
@@ -4742,7 +4847,7 @@
         </w:tc>
         <w:tc>
           <w:tcPr>
-            <w:tcW w:type="dxa" w:w="1700"/>
+            <w:tcW w:type="dxa" w:w="1937"/>
             <w:tcBorders>
               <w:top w:val="single" w:color="BBBBBB" w:sz="4"/>
               <w:left w:val="single" w:color="BBBBBB" w:sz="4"/>
@@ -4759,28 +4864,6 @@
           <w:p>
             <w:r>
               <w:t xml:space="preserve">48,0%</w:t>
-            </w:r>
-          </w:p>
-        </w:tc>
-        <w:tc>
-          <w:tcPr>
-            <w:tcW w:type="dxa" w:w="1426"/>
-            <w:tcBorders>
-              <w:top w:val="single" w:color="BBBBBB" w:sz="4"/>
-              <w:left w:val="single" w:color="BBBBBB" w:sz="4"/>
-              <w:bottom w:val="single" w:color="BBBBBB" w:sz="4"/>
-              <w:right w:val="single" w:color="BBBBBB" w:sz="4"/>
-            </w:tcBorders>
-            <w:tcMar>
-              <w:top w:type="dxa" w:w="50"/>
-              <w:left w:type="dxa" w:w="90"/>
-              <w:bottom w:type="dxa" w:w="50"/>
-              <w:right w:type="dxa" w:w="90"/>
-            </w:tcMar>
-          </w:tcPr>
-          <w:p>
-            <w:r>
-              <w:t xml:space="preserve">2,0</w:t>
             </w:r>
           </w:p>
         </w:tc>
@@ -4791,7 +4874,7 @@
         </w:trPr>
         <w:tc>
           <w:tcPr>
-            <w:tcW w:type="dxa" w:w="900"/>
+            <w:tcW w:type="dxa" w:w="1137"/>
             <w:tcBorders>
               <w:top w:val="single" w:color="BBBBBB" w:sz="4"/>
               <w:left w:val="single" w:color="BBBBBB" w:sz="4"/>
@@ -4808,13 +4891,16 @@
           </w:tcPr>
           <w:p>
             <w:r>
+              <w:rPr>
+                <w:b/>
+              </w:rPr>
               <w:t xml:space="preserve">0,65</w:t>
             </w:r>
           </w:p>
         </w:tc>
         <w:tc>
           <w:tcPr>
-            <w:tcW w:type="dxa" w:w="1100"/>
+            <w:tcW w:type="dxa" w:w="1337"/>
             <w:tcBorders>
               <w:top w:val="single" w:color="BBBBBB" w:sz="4"/>
               <w:left w:val="single" w:color="BBBBBB" w:sz="4"/>
@@ -4831,13 +4917,16 @@
           </w:tcPr>
           <w:p>
             <w:r>
+              <w:rPr>
+                <w:b/>
+              </w:rPr>
               <w:t xml:space="preserve">871</w:t>
             </w:r>
           </w:p>
         </w:tc>
         <w:tc>
           <w:tcPr>
-            <w:tcW w:type="dxa" w:w="1000"/>
+            <w:tcW w:type="dxa" w:w="1237"/>
             <w:tcBorders>
               <w:top w:val="single" w:color="BBBBBB" w:sz="4"/>
               <w:left w:val="single" w:color="BBBBBB" w:sz="4"/>
@@ -4854,13 +4943,16 @@
           </w:tcPr>
           <w:p>
             <w:r>
+              <w:rPr>
+                <w:b/>
+              </w:rPr>
               <w:t xml:space="preserve">0,109</w:t>
             </w:r>
           </w:p>
         </w:tc>
         <w:tc>
           <w:tcPr>
-            <w:tcW w:type="dxa" w:w="1400"/>
+            <w:tcW w:type="dxa" w:w="1637"/>
             <w:tcBorders>
               <w:top w:val="single" w:color="BBBBBB" w:sz="4"/>
               <w:left w:val="single" w:color="BBBBBB" w:sz="4"/>
@@ -4887,7 +4979,7 @@
         </w:tc>
         <w:tc>
           <w:tcPr>
-            <w:tcW w:type="dxa" w:w="1500"/>
+            <w:tcW w:type="dxa" w:w="1737"/>
             <w:tcBorders>
               <w:top w:val="single" w:color="BBBBBB" w:sz="4"/>
               <w:left w:val="single" w:color="BBBBBB" w:sz="4"/>
@@ -4914,7 +5006,7 @@
         </w:tc>
         <w:tc>
           <w:tcPr>
-            <w:tcW w:type="dxa" w:w="1700"/>
+            <w:tcW w:type="dxa" w:w="1937"/>
             <w:tcBorders>
               <w:top w:val="single" w:color="BBBBBB" w:sz="4"/>
               <w:left w:val="single" w:color="BBBBBB" w:sz="4"/>
@@ -4931,30 +5023,10 @@
           </w:tcPr>
           <w:p>
             <w:r>
+              <w:rPr>
+                <w:b/>
+              </w:rPr>
               <w:t xml:space="preserve">47,4%</w:t>
-            </w:r>
-          </w:p>
-        </w:tc>
-        <w:tc>
-          <w:tcPr>
-            <w:tcW w:type="dxa" w:w="1426"/>
-            <w:tcBorders>
-              <w:top w:val="single" w:color="BBBBBB" w:sz="4"/>
-              <w:left w:val="single" w:color="BBBBBB" w:sz="4"/>
-              <w:bottom w:val="single" w:color="BBBBBB" w:sz="4"/>
-              <w:right w:val="single" w:color="BBBBBB" w:sz="4"/>
-            </w:tcBorders>
-            <w:shd w:fill="E2EFDA" w:color="auto" w:val="clear"/>
-            <w:tcMar>
-              <w:top w:type="dxa" w:w="50"/>
-              <w:left w:type="dxa" w:w="90"/>
-              <w:bottom w:type="dxa" w:w="50"/>
-              <w:right w:type="dxa" w:w="90"/>
-            </w:tcMar>
-          </w:tcPr>
-          <w:p>
-            <w:r>
-              <w:t xml:space="preserve">2,4</w:t>
             </w:r>
           </w:p>
         </w:tc>
@@ -4965,7 +5037,7 @@
         </w:trPr>
         <w:tc>
           <w:tcPr>
-            <w:tcW w:type="dxa" w:w="900"/>
+            <w:tcW w:type="dxa" w:w="1137"/>
             <w:tcBorders>
               <w:top w:val="single" w:color="BBBBBB" w:sz="4"/>
               <w:left w:val="single" w:color="BBBBBB" w:sz="4"/>
@@ -4987,7 +5059,7 @@
         </w:tc>
         <w:tc>
           <w:tcPr>
-            <w:tcW w:type="dxa" w:w="1100"/>
+            <w:tcW w:type="dxa" w:w="1337"/>
             <w:tcBorders>
               <w:top w:val="single" w:color="BBBBBB" w:sz="4"/>
               <w:left w:val="single" w:color="BBBBBB" w:sz="4"/>
@@ -5009,7 +5081,7 @@
         </w:tc>
         <w:tc>
           <w:tcPr>
-            <w:tcW w:type="dxa" w:w="1000"/>
+            <w:tcW w:type="dxa" w:w="1237"/>
             <w:tcBorders>
               <w:top w:val="single" w:color="BBBBBB" w:sz="4"/>
               <w:left w:val="single" w:color="BBBBBB" w:sz="4"/>
@@ -5031,7 +5103,7 @@
         </w:tc>
         <w:tc>
           <w:tcPr>
-            <w:tcW w:type="dxa" w:w="1400"/>
+            <w:tcW w:type="dxa" w:w="1637"/>
             <w:tcBorders>
               <w:top w:val="single" w:color="BBBBBB" w:sz="4"/>
               <w:left w:val="single" w:color="BBBBBB" w:sz="4"/>
@@ -5053,7 +5125,7 @@
         </w:tc>
         <w:tc>
           <w:tcPr>
-            <w:tcW w:type="dxa" w:w="1500"/>
+            <w:tcW w:type="dxa" w:w="1737"/>
             <w:tcBorders>
               <w:top w:val="single" w:color="BBBBBB" w:sz="4"/>
               <w:left w:val="single" w:color="BBBBBB" w:sz="4"/>
@@ -5075,7 +5147,7 @@
         </w:tc>
         <w:tc>
           <w:tcPr>
-            <w:tcW w:type="dxa" w:w="1700"/>
+            <w:tcW w:type="dxa" w:w="1937"/>
             <w:tcBorders>
               <w:top w:val="single" w:color="BBBBBB" w:sz="4"/>
               <w:left w:val="single" w:color="BBBBBB" w:sz="4"/>
@@ -5092,28 +5164,6 @@
           <w:p>
             <w:r>
               <w:t xml:space="preserve">49,8%</w:t>
-            </w:r>
-          </w:p>
-        </w:tc>
-        <w:tc>
-          <w:tcPr>
-            <w:tcW w:type="dxa" w:w="1426"/>
-            <w:tcBorders>
-              <w:top w:val="single" w:color="BBBBBB" w:sz="4"/>
-              <w:left w:val="single" w:color="BBBBBB" w:sz="4"/>
-              <w:bottom w:val="single" w:color="BBBBBB" w:sz="4"/>
-              <w:right w:val="single" w:color="BBBBBB" w:sz="4"/>
-            </w:tcBorders>
-            <w:tcMar>
-              <w:top w:type="dxa" w:w="50"/>
-              <w:left w:type="dxa" w:w="90"/>
-              <w:bottom w:type="dxa" w:w="50"/>
-              <w:right w:type="dxa" w:w="90"/>
-            </w:tcMar>
-          </w:tcPr>
-          <w:p>
-            <w:r>
-              <w:t xml:space="preserve">3,4</w:t>
             </w:r>
           </w:p>
         </w:tc>
@@ -5124,155 +5174,133 @@
         </w:trPr>
         <w:tc>
           <w:tcPr>
-            <w:tcW w:type="dxa" w:w="900"/>
-            <w:tcBorders>
-              <w:top w:val="single" w:color="BBBBBB" w:sz="4"/>
-              <w:left w:val="single" w:color="BBBBBB" w:sz="4"/>
-              <w:bottom w:val="single" w:color="BBBBBB" w:sz="4"/>
-              <w:right w:val="single" w:color="BBBBBB" w:sz="4"/>
-            </w:tcBorders>
-            <w:tcMar>
-              <w:top w:type="dxa" w:w="50"/>
-              <w:left w:type="dxa" w:w="90"/>
-              <w:bottom w:type="dxa" w:w="50"/>
-              <w:right w:type="dxa" w:w="90"/>
-            </w:tcMar>
-          </w:tcPr>
-          <w:p>
-            <w:r>
-              <w:t xml:space="preserve">0,80</w:t>
-            </w:r>
-          </w:p>
-        </w:tc>
-        <w:tc>
-          <w:tcPr>
-            <w:tcW w:type="dxa" w:w="1100"/>
-            <w:tcBorders>
-              <w:top w:val="single" w:color="BBBBBB" w:sz="4"/>
-              <w:left w:val="single" w:color="BBBBBB" w:sz="4"/>
-              <w:bottom w:val="single" w:color="BBBBBB" w:sz="4"/>
-              <w:right w:val="single" w:color="BBBBBB" w:sz="4"/>
-            </w:tcBorders>
-            <w:tcMar>
-              <w:top w:type="dxa" w:w="50"/>
-              <w:left w:type="dxa" w:w="90"/>
-              <w:bottom w:type="dxa" w:w="50"/>
-              <w:right w:type="dxa" w:w="90"/>
-            </w:tcMar>
-          </w:tcPr>
-          <w:p>
-            <w:r>
-              <w:t xml:space="preserve">2.221</w:t>
-            </w:r>
-          </w:p>
-        </w:tc>
-        <w:tc>
-          <w:tcPr>
-            <w:tcW w:type="dxa" w:w="1000"/>
-            <w:tcBorders>
-              <w:top w:val="single" w:color="BBBBBB" w:sz="4"/>
-              <w:left w:val="single" w:color="BBBBBB" w:sz="4"/>
-              <w:bottom w:val="single" w:color="BBBBBB" w:sz="4"/>
-              <w:right w:val="single" w:color="BBBBBB" w:sz="4"/>
-            </w:tcBorders>
-            <w:tcMar>
-              <w:top w:type="dxa" w:w="50"/>
-              <w:left w:type="dxa" w:w="90"/>
-              <w:bottom w:type="dxa" w:w="50"/>
-              <w:right w:type="dxa" w:w="90"/>
-            </w:tcMar>
-          </w:tcPr>
-          <w:p>
-            <w:r>
-              <w:t xml:space="preserve">0,278</w:t>
-            </w:r>
-          </w:p>
-        </w:tc>
-        <w:tc>
-          <w:tcPr>
-            <w:tcW w:type="dxa" w:w="1400"/>
-            <w:tcBorders>
-              <w:top w:val="single" w:color="BBBBBB" w:sz="4"/>
-              <w:left w:val="single" w:color="BBBBBB" w:sz="4"/>
-              <w:bottom w:val="single" w:color="BBBBBB" w:sz="4"/>
-              <w:right w:val="single" w:color="BBBBBB" w:sz="4"/>
-            </w:tcBorders>
-            <w:tcMar>
-              <w:top w:type="dxa" w:w="50"/>
-              <w:left w:type="dxa" w:w="90"/>
-              <w:bottom w:type="dxa" w:w="50"/>
-              <w:right w:type="dxa" w:w="90"/>
-            </w:tcMar>
-          </w:tcPr>
-          <w:p>
-            <w:r>
-              <w:t xml:space="preserve">90,2%</w:t>
-            </w:r>
-          </w:p>
-        </w:tc>
-        <w:tc>
-          <w:tcPr>
-            <w:tcW w:type="dxa" w:w="1500"/>
-            <w:tcBorders>
-              <w:top w:val="single" w:color="BBBBBB" w:sz="4"/>
-              <w:left w:val="single" w:color="BBBBBB" w:sz="4"/>
-              <w:bottom w:val="single" w:color="BBBBBB" w:sz="4"/>
-              <w:right w:val="single" w:color="BBBBBB" w:sz="4"/>
-            </w:tcBorders>
-            <w:tcMar>
-              <w:top w:type="dxa" w:w="50"/>
-              <w:left w:type="dxa" w:w="90"/>
-              <w:bottom w:type="dxa" w:w="50"/>
-              <w:right w:type="dxa" w:w="90"/>
-            </w:tcMar>
-          </w:tcPr>
-          <w:p>
-            <w:r>
-              <w:t xml:space="preserve">0,98</w:t>
-            </w:r>
-          </w:p>
-        </w:tc>
-        <w:tc>
-          <w:tcPr>
-            <w:tcW w:type="dxa" w:w="1700"/>
-            <w:tcBorders>
-              <w:top w:val="single" w:color="BBBBBB" w:sz="4"/>
-              <w:left w:val="single" w:color="BBBBBB" w:sz="4"/>
-              <w:bottom w:val="single" w:color="BBBBBB" w:sz="4"/>
-              <w:right w:val="single" w:color="BBBBBB" w:sz="4"/>
-            </w:tcBorders>
-            <w:tcMar>
-              <w:top w:type="dxa" w:w="50"/>
-              <w:left w:type="dxa" w:w="90"/>
-              <w:bottom w:type="dxa" w:w="50"/>
-              <w:right w:type="dxa" w:w="90"/>
-            </w:tcMar>
-          </w:tcPr>
-          <w:p>
-            <w:r>
-              <w:t xml:space="preserve">49,8%</w:t>
-            </w:r>
-          </w:p>
-        </w:tc>
-        <w:tc>
-          <w:tcPr>
-            <w:tcW w:type="dxa" w:w="1426"/>
-            <w:tcBorders>
-              <w:top w:val="single" w:color="BBBBBB" w:sz="4"/>
-              <w:left w:val="single" w:color="BBBBBB" w:sz="4"/>
-              <w:bottom w:val="single" w:color="BBBBBB" w:sz="4"/>
-              <w:right w:val="single" w:color="BBBBBB" w:sz="4"/>
-            </w:tcBorders>
-            <w:tcMar>
-              <w:top w:type="dxa" w:w="50"/>
-              <w:left w:type="dxa" w:w="90"/>
-              <w:bottom w:type="dxa" w:w="50"/>
-              <w:right w:type="dxa" w:w="90"/>
-            </w:tcMar>
-          </w:tcPr>
-          <w:p>
-            <w:r>
-              <w:t xml:space="preserve">6,0</w:t>
+            <w:tcW w:type="dxa" w:w="1137"/>
+            <w:tcBorders>
+              <w:top w:val="single" w:color="BBBBBB" w:sz="4"/>
+              <w:left w:val="single" w:color="BBBBBB" w:sz="4"/>
+              <w:bottom w:val="single" w:color="BBBBBB" w:sz="4"/>
+              <w:right w:val="single" w:color="BBBBBB" w:sz="4"/>
+            </w:tcBorders>
+            <w:tcMar>
+              <w:top w:type="dxa" w:w="50"/>
+              <w:left w:type="dxa" w:w="90"/>
+              <w:bottom w:type="dxa" w:w="50"/>
+              <w:right w:type="dxa" w:w="90"/>
+            </w:tcMar>
+          </w:tcPr>
+          <w:p>
+            <w:r>
+              <w:t>0,75</w:t>
+            </w:r>
+          </w:p>
+        </w:tc>
+        <w:tc>
+          <w:tcPr>
+            <w:tcW w:type="dxa" w:w="1337"/>
+            <w:tcBorders>
+              <w:top w:val="single" w:color="BBBBBB" w:sz="4"/>
+              <w:left w:val="single" w:color="BBBBBB" w:sz="4"/>
+              <w:bottom w:val="single" w:color="BBBBBB" w:sz="4"/>
+              <w:right w:val="single" w:color="BBBBBB" w:sz="4"/>
+            </w:tcBorders>
+            <w:tcMar>
+              <w:top w:type="dxa" w:w="50"/>
+              <w:left w:type="dxa" w:w="90"/>
+              <w:bottom w:type="dxa" w:w="50"/>
+              <w:right w:type="dxa" w:w="90"/>
+            </w:tcMar>
+          </w:tcPr>
+          <w:p>
+            <w:r>
+              <w:t>1.709</w:t>
+            </w:r>
+          </w:p>
+        </w:tc>
+        <w:tc>
+          <w:tcPr>
+            <w:tcW w:type="dxa" w:w="1237"/>
+            <w:tcBorders>
+              <w:top w:val="single" w:color="BBBBBB" w:sz="4"/>
+              <w:left w:val="single" w:color="BBBBBB" w:sz="4"/>
+              <w:bottom w:val="single" w:color="BBBBBB" w:sz="4"/>
+              <w:right w:val="single" w:color="BBBBBB" w:sz="4"/>
+            </w:tcBorders>
+            <w:tcMar>
+              <w:top w:type="dxa" w:w="50"/>
+              <w:left w:type="dxa" w:w="90"/>
+              <w:bottom w:type="dxa" w:w="50"/>
+              <w:right w:type="dxa" w:w="90"/>
+            </w:tcMar>
+          </w:tcPr>
+          <w:p>
+            <w:r>
+              <w:t>0,214</w:t>
+            </w:r>
+          </w:p>
+        </w:tc>
+        <w:tc>
+          <w:tcPr>
+            <w:tcW w:type="dxa" w:w="1637"/>
+            <w:tcBorders>
+              <w:top w:val="single" w:color="BBBBBB" w:sz="4"/>
+              <w:left w:val="single" w:color="BBBBBB" w:sz="4"/>
+              <w:bottom w:val="single" w:color="BBBBBB" w:sz="4"/>
+              <w:right w:val="single" w:color="BBBBBB" w:sz="4"/>
+            </w:tcBorders>
+            <w:tcMar>
+              <w:top w:type="dxa" w:w="50"/>
+              <w:left w:type="dxa" w:w="90"/>
+              <w:bottom w:type="dxa" w:w="50"/>
+              <w:right w:type="dxa" w:w="90"/>
+            </w:tcMar>
+          </w:tcPr>
+          <w:p>
+            <w:r>
+              <w:t>87,9%</w:t>
+            </w:r>
+          </w:p>
+        </w:tc>
+        <w:tc>
+          <w:tcPr>
+            <w:tcW w:type="dxa" w:w="1737"/>
+            <w:tcBorders>
+              <w:top w:val="single" w:color="BBBBBB" w:sz="4"/>
+              <w:left w:val="single" w:color="BBBBBB" w:sz="4"/>
+              <w:bottom w:val="single" w:color="BBBBBB" w:sz="4"/>
+              <w:right w:val="single" w:color="BBBBBB" w:sz="4"/>
+            </w:tcBorders>
+            <w:tcMar>
+              <w:top w:type="dxa" w:w="50"/>
+              <w:left w:type="dxa" w:w="90"/>
+              <w:bottom w:type="dxa" w:w="50"/>
+              <w:right w:type="dxa" w:w="90"/>
+            </w:tcMar>
+          </w:tcPr>
+          <w:p>
+            <w:r>
+              <w:t>0,97</w:t>
+            </w:r>
+          </w:p>
+        </w:tc>
+        <w:tc>
+          <w:tcPr>
+            <w:tcW w:type="dxa" w:w="1937"/>
+            <w:tcBorders>
+              <w:top w:val="single" w:color="BBBBBB" w:sz="4"/>
+              <w:left w:val="single" w:color="BBBBBB" w:sz="4"/>
+              <w:bottom w:val="single" w:color="BBBBBB" w:sz="4"/>
+              <w:right w:val="single" w:color="BBBBBB" w:sz="4"/>
+            </w:tcBorders>
+            <w:tcMar>
+              <w:top w:type="dxa" w:w="50"/>
+              <w:left w:type="dxa" w:w="90"/>
+              <w:bottom w:type="dxa" w:w="50"/>
+              <w:right w:type="dxa" w:w="90"/>
+            </w:tcMar>
+          </w:tcPr>
+          <w:p>
+            <w:r>
+              <w:t>48,6%</w:t>
             </w:r>
           </w:p>
         </w:tc>
@@ -5283,7 +5311,144 @@
         </w:trPr>
         <w:tc>
           <w:tcPr>
-            <w:tcW w:type="dxa" w:w="900"/>
+            <w:tcW w:type="dxa" w:w="1137"/>
+            <w:tcBorders>
+              <w:top w:val="single" w:color="BBBBBB" w:sz="4"/>
+              <w:left w:val="single" w:color="BBBBBB" w:sz="4"/>
+              <w:bottom w:val="single" w:color="BBBBBB" w:sz="4"/>
+              <w:right w:val="single" w:color="BBBBBB" w:sz="4"/>
+            </w:tcBorders>
+            <w:tcMar>
+              <w:top w:type="dxa" w:w="50"/>
+              <w:left w:type="dxa" w:w="90"/>
+              <w:bottom w:type="dxa" w:w="50"/>
+              <w:right w:type="dxa" w:w="90"/>
+            </w:tcMar>
+          </w:tcPr>
+          <w:p>
+            <w:r>
+              <w:t xml:space="preserve">0,80</w:t>
+            </w:r>
+          </w:p>
+        </w:tc>
+        <w:tc>
+          <w:tcPr>
+            <w:tcW w:type="dxa" w:w="1337"/>
+            <w:tcBorders>
+              <w:top w:val="single" w:color="BBBBBB" w:sz="4"/>
+              <w:left w:val="single" w:color="BBBBBB" w:sz="4"/>
+              <w:bottom w:val="single" w:color="BBBBBB" w:sz="4"/>
+              <w:right w:val="single" w:color="BBBBBB" w:sz="4"/>
+            </w:tcBorders>
+            <w:tcMar>
+              <w:top w:type="dxa" w:w="50"/>
+              <w:left w:type="dxa" w:w="90"/>
+              <w:bottom w:type="dxa" w:w="50"/>
+              <w:right w:type="dxa" w:w="90"/>
+            </w:tcMar>
+          </w:tcPr>
+          <w:p>
+            <w:r>
+              <w:t xml:space="preserve">2.221</w:t>
+            </w:r>
+          </w:p>
+        </w:tc>
+        <w:tc>
+          <w:tcPr>
+            <w:tcW w:type="dxa" w:w="1237"/>
+            <w:tcBorders>
+              <w:top w:val="single" w:color="BBBBBB" w:sz="4"/>
+              <w:left w:val="single" w:color="BBBBBB" w:sz="4"/>
+              <w:bottom w:val="single" w:color="BBBBBB" w:sz="4"/>
+              <w:right w:val="single" w:color="BBBBBB" w:sz="4"/>
+            </w:tcBorders>
+            <w:tcMar>
+              <w:top w:type="dxa" w:w="50"/>
+              <w:left w:type="dxa" w:w="90"/>
+              <w:bottom w:type="dxa" w:w="50"/>
+              <w:right w:type="dxa" w:w="90"/>
+            </w:tcMar>
+          </w:tcPr>
+          <w:p>
+            <w:r>
+              <w:t xml:space="preserve">0,278</w:t>
+            </w:r>
+          </w:p>
+        </w:tc>
+        <w:tc>
+          <w:tcPr>
+            <w:tcW w:type="dxa" w:w="1637"/>
+            <w:tcBorders>
+              <w:top w:val="single" w:color="BBBBBB" w:sz="4"/>
+              <w:left w:val="single" w:color="BBBBBB" w:sz="4"/>
+              <w:bottom w:val="single" w:color="BBBBBB" w:sz="4"/>
+              <w:right w:val="single" w:color="BBBBBB" w:sz="4"/>
+            </w:tcBorders>
+            <w:tcMar>
+              <w:top w:type="dxa" w:w="50"/>
+              <w:left w:type="dxa" w:w="90"/>
+              <w:bottom w:type="dxa" w:w="50"/>
+              <w:right w:type="dxa" w:w="90"/>
+            </w:tcMar>
+          </w:tcPr>
+          <w:p>
+            <w:r>
+              <w:t xml:space="preserve">90,2%</w:t>
+            </w:r>
+          </w:p>
+        </w:tc>
+        <w:tc>
+          <w:tcPr>
+            <w:tcW w:type="dxa" w:w="1737"/>
+            <w:tcBorders>
+              <w:top w:val="single" w:color="BBBBBB" w:sz="4"/>
+              <w:left w:val="single" w:color="BBBBBB" w:sz="4"/>
+              <w:bottom w:val="single" w:color="BBBBBB" w:sz="4"/>
+              <w:right w:val="single" w:color="BBBBBB" w:sz="4"/>
+            </w:tcBorders>
+            <w:tcMar>
+              <w:top w:type="dxa" w:w="50"/>
+              <w:left w:type="dxa" w:w="90"/>
+              <w:bottom w:type="dxa" w:w="50"/>
+              <w:right w:type="dxa" w:w="90"/>
+            </w:tcMar>
+          </w:tcPr>
+          <w:p>
+            <w:r>
+              <w:t xml:space="preserve">0,98</w:t>
+            </w:r>
+          </w:p>
+        </w:tc>
+        <w:tc>
+          <w:tcPr>
+            <w:tcW w:type="dxa" w:w="1937"/>
+            <w:tcBorders>
+              <w:top w:val="single" w:color="BBBBBB" w:sz="4"/>
+              <w:left w:val="single" w:color="BBBBBB" w:sz="4"/>
+              <w:bottom w:val="single" w:color="BBBBBB" w:sz="4"/>
+              <w:right w:val="single" w:color="BBBBBB" w:sz="4"/>
+            </w:tcBorders>
+            <w:tcMar>
+              <w:top w:type="dxa" w:w="50"/>
+              <w:left w:type="dxa" w:w="90"/>
+              <w:bottom w:type="dxa" w:w="50"/>
+              <w:right w:type="dxa" w:w="90"/>
+            </w:tcMar>
+          </w:tcPr>
+          <w:p>
+            <w:r>
+              <w:t xml:space="preserve">49,8%</w:t>
+            </w:r>
+          </w:p>
+        </w:tc>
+      </w:tr>
+      <w:tr>
+        <w:trPr>
+          <w:tblHeader w:val="false"/>
+        </w:trPr>
+        <w:tc>
+          <w:tcPr>
+            <w:tcW w:type="dxa" w:w="1137"/>
             <w:tcBorders>
               <w:top w:val="single" w:color="BBBBBB" w:sz="4"/>
               <w:left w:val="single" w:color="BBBBBB" w:sz="4"/>
@@ -5305,7 +5470,7 @@
         </w:tc>
         <w:tc>
           <w:tcPr>
-            <w:tcW w:type="dxa" w:w="1100"/>
+            <w:tcW w:type="dxa" w:w="1337"/>
             <w:tcBorders>
               <w:top w:val="single" w:color="BBBBBB" w:sz="4"/>
               <w:left w:val="single" w:color="BBBBBB" w:sz="4"/>
@@ -5327,7 +5492,7 @@
         </w:tc>
         <w:tc>
           <w:tcPr>
-            <w:tcW w:type="dxa" w:w="1000"/>
+            <w:tcW w:type="dxa" w:w="1237"/>
             <w:tcBorders>
               <w:top w:val="single" w:color="BBBBBB" w:sz="4"/>
               <w:left w:val="single" w:color="BBBBBB" w:sz="4"/>
@@ -5349,7 +5514,7 @@
         </w:tc>
         <w:tc>
           <w:tcPr>
-            <w:tcW w:type="dxa" w:w="1400"/>
+            <w:tcW w:type="dxa" w:w="1637"/>
             <w:tcBorders>
               <w:top w:val="single" w:color="BBBBBB" w:sz="4"/>
               <w:left w:val="single" w:color="BBBBBB" w:sz="4"/>
@@ -5371,7 +5536,7 @@
         </w:tc>
         <w:tc>
           <w:tcPr>
-            <w:tcW w:type="dxa" w:w="1500"/>
+            <w:tcW w:type="dxa" w:w="1737"/>
             <w:tcBorders>
               <w:top w:val="single" w:color="BBBBBB" w:sz="4"/>
               <w:left w:val="single" w:color="BBBBBB" w:sz="4"/>
@@ -5393,29 +5558,7 @@
         </w:tc>
         <w:tc>
           <w:tcPr>
-            <w:tcW w:type="dxa" w:w="1700"/>
-            <w:tcBorders>
-              <w:top w:val="single" w:color="BBBBBB" w:sz="4"/>
-              <w:left w:val="single" w:color="BBBBBB" w:sz="4"/>
-              <w:bottom w:val="single" w:color="BBBBBB" w:sz="4"/>
-              <w:right w:val="single" w:color="BBBBBB" w:sz="4"/>
-            </w:tcBorders>
-            <w:tcMar>
-              <w:top w:type="dxa" w:w="50"/>
-              <w:left w:type="dxa" w:w="90"/>
-              <w:bottom w:type="dxa" w:w="50"/>
-              <w:right w:type="dxa" w:w="90"/>
-            </w:tcMar>
-          </w:tcPr>
-          <w:p>
-            <w:r>
-              <w:t xml:space="preserve">—</w:t>
-            </w:r>
-          </w:p>
-        </w:tc>
-        <w:tc>
-          <w:tcPr>
-            <w:tcW w:type="dxa" w:w="1426"/>
+            <w:tcW w:type="dxa" w:w="1937"/>
             <w:tcBorders>
               <w:top w:val="single" w:color="BBBBBB" w:sz="4"/>
               <w:left w:val="single" w:color="BBBBBB" w:sz="4"/>
@@ -5449,7 +5592,7 @@
           <w:sz w:val="18"/>
           <w:szCs w:val="18"/>
         </w:rPr>
-        <w:t xml:space="preserve">Fuente: data/output/barrido_rho_art1.csv. Referencias: predecir siempre la media global da MAE 1,33; usar solo la clase EM, MAE 0,99 y 49,8% de aciertos.</w:t>
+        <w:t>Fuente: data/output/barrido_rho_art1.csv (se regenera con python -m src.barrido_rho). Referencias: predecir siempre la media global da MAE 1,33; usar solo la clase EM, MAE 0,99 y 49,8% de aciertos.</w:t>
       </w:r>
     </w:p>
     <w:p>
@@ -5457,17 +5600,115 @@
         <w:spacing w:after="120"/>
       </w:pPr>
       <w:r>
-        <w:t xml:space="preserve">Con </w:t>
-      </w:r>
+        <w:rPr>
+          <w:b/>
+        </w:rPr>
+        <w:t xml:space="preserve">Por qué ρ = 0,65 (D-13). </w:t>
+      </w:r>
+      <w:r>
+        <w:rPr/>
+        <w:t>Es el único valor que cumple las tres metas a la vez con la red más simple:</w:t>
+      </w:r>
+    </w:p>
+    <w:p>
+      <w:pPr>
+        <w:pStyle w:val="ListParagraph"/>
+        <w:numPr>
+          <w:ilvl w:val="0"/>
+          <w:numId w:val="2"/>
+        </w:numPr>
+        <w:spacing w:after="60"/>
+      </w:pPr>
       <w:r>
         <w:rPr>
           <w:b/>
           <w:bCs/>
         </w:rPr>
-        <w:t xml:space="preserve">ρ = 0,65</w:t>
-      </w:r>
-      <w:r>
-        <w:t xml:space="preserve"> la pureza supera el 80% con 871 nodos y se obtiene el menor error (0,94 puntos sobre 10), mejor que la media global (1,33) y que el EM solo (0,99). Subir ρ multiplica los nodos sin bajar el error. El ρ final todavía no está fijado.</w:t>
+        <w:t xml:space="preserve">ρ ≤ 0,60: </w:t>
+      </w:r>
+      <w:r>
+        <w:rPr>
+          <w:bCs/>
+        </w:rPr>
+        <w:t>no llega al 80% de pureza (0,60 da 78,3%); los nodos mezclan alumnos de categorías distintas.</w:t>
+      </w:r>
+    </w:p>
+    <w:p>
+      <w:pPr>
+        <w:pStyle w:val="ListParagraph"/>
+        <w:numPr>
+          <w:ilvl w:val="0"/>
+          <w:numId w:val="2"/>
+        </w:numPr>
+        <w:spacing w:after="60"/>
+      </w:pPr>
+      <w:r>
+        <w:rPr>
+          <w:b/>
+          <w:bCs/>
+        </w:rPr>
+        <w:t xml:space="preserve">ρ = 0,65: </w:t>
+      </w:r>
+      <w:r>
+        <w:rPr>
+          <w:bCs/>
+        </w:rPr>
+        <w:t>pureza 81,4%, CR 0,109 (unos 9 alumnos por nodo) y el menor MAE de todo el barrido, 0,94 puntos sobre 10.</w:t>
+      </w:r>
+    </w:p>
+    <w:p>
+      <w:pPr>
+        <w:pStyle w:val="ListParagraph"/>
+        <w:numPr>
+          <w:ilvl w:val="0"/>
+          <w:numId w:val="2"/>
+        </w:numPr>
+        <w:spacing w:after="60"/>
+      </w:pPr>
+      <w:r>
+        <w:rPr>
+          <w:b/>
+          <w:bCs/>
+        </w:rPr>
+        <w:t xml:space="preserve">ρ = 0,70: </w:t>
+      </w:r>
+      <w:r>
+        <w:rPr>
+          <w:bCs/>
+        </w:rPr>
+        <w:t>también cumple pureza (84,5%) y CR (0,153), pero usa 40% más nodos (1.220, unos 6,5 alumnos por nodo) y el MAE no mejora (0,96).</w:t>
+      </w:r>
+    </w:p>
+    <w:p>
+      <w:pPr>
+        <w:pStyle w:val="ListParagraph"/>
+        <w:numPr>
+          <w:ilvl w:val="0"/>
+          <w:numId w:val="2"/>
+        </w:numPr>
+        <w:spacing w:after="60"/>
+      </w:pPr>
+      <w:r>
+        <w:rPr>
+          <w:b/>
+          <w:bCs/>
+        </w:rPr>
+        <w:t xml:space="preserve">ρ ≥ 0,75: </w:t>
+      </w:r>
+      <w:r>
+        <w:rPr>
+          <w:bCs/>
+        </w:rPr>
+        <w:t>el CR sale del rango (0,214) y el error sigue sin bajar; con 0,90 la red supera los 3.000 nodos.</w:t>
+      </w:r>
+    </w:p>
+    <w:p>
+      <w:pPr>
+        <w:spacing w:after="120"/>
+      </w:pPr>
+      <w:r>
+        <w:rPr/>
+        <w:t>Subir ρ hace nodos más chicos y más puros, pero cada nodo calcula su nota esperada con menos alumnos y la red empieza a memorizar en vez de generalizar: la pureza sube y la predicción no mejora. Igual que con el BIC, entre los valores que cumplen se elige el más simple. La diferencia con 0,70 es chica y se midió con una sola semilla.</w:t>
       </w:r>
     </w:p>
     <w:p>
@@ -5924,7 +6165,7 @@
           </w:tcPr>
           <w:p>
             <w:r>
-              <w:t xml:space="preserve">scripts/barrido_rho_art1.py</w:t>
+              <w:t>src/barrido_rho.py</w:t>
             </w:r>
           </w:p>
         </w:tc>
@@ -5946,7 +6187,7 @@
           </w:tcPr>
           <w:p>
             <w:r>
-              <w:t xml:space="preserve">Corre todo el pipeline para cada ρ y guarda la tabla de la sección 6.3.</w:t>
+              <w:t>Barrido de ρ: corre el pipeline para cada valor y guarda la tabla de la sección 6.3.</w:t>
             </w:r>
           </w:p>
         </w:tc>
@@ -6156,7 +6397,7 @@
           <w:sz w:val="19"/>
           <w:szCs w:val="19"/>
         </w:rPr>
-        <w:t xml:space="preserve">python scripts/barrido_rho_art1.py</w:t>
+        <w:t>python -m src.barrido_rho</w:t>
       </w:r>
     </w:p>
     <w:p>
@@ -6278,19 +6519,6 @@
       </w:pPr>
       <w:r>
         <w:t xml:space="preserve">9. Próximos pasos</w:t>
-      </w:r>
-    </w:p>
-    <w:p>
-      <w:pPr>
-        <w:pStyle w:val="ListParagraph"/>
-        <w:numPr>
-          <w:ilvl w:val="0"/>
-          <w:numId w:val="3"/>
-        </w:numPr>
-        <w:spacing w:after="60"/>
-      </w:pPr>
-      <w:r>
-        <w:t xml:space="preserve">Fijar el ρ final a partir del barrido (ISSUE-103).</w:t>
       </w:r>
     </w:p>
     <w:p>

</xml_diff>

<commit_message>
Informes: avance (secciones 6.5 y 10) e informe evaluativo final con figuras
Co-Authored-By: Claude Sonnet 5.5 <noreply@anthropic.com>
Claude-Session: https://claude.ai/code/session_01D27Xoqa7g3oFE5fZmuutpf
</commit_message>
<xml_diff>
--- a/docs/Informe_avance_TFI.docx
+++ b/docs/Informe_avance_TFI.docx
@@ -6894,6 +6894,727 @@
           <w:bCs/>
         </w:rPr>
         <w:t>ART 1 no sabe que "más es mejor", solo compara bits. Un cambio de bin lleva al alumno a otro nodo, con otros compañeros y otra nota media. Además, el código binario posicional (D-12) no es ordinal: 4 (0100) y 5 (0101) difieren en un bit, pero 7 (0111) y 8 (1000) no comparten ninguno. Y 399 de los 847 nodos tienen menos de 5 alumnos, así que su nota media es ruidosa. Es una limitación propia de la arquitectura (ART 1 + codificación binaria pedida por la cátedra), no un error del código, y se decidió mantener el modelo así (D-17). La diferencia suele estar dentro del error normal (MAE 0,94), pero cerca de un límite puede cambiar la categoría.</w:t>
+      </w:r>
+    </w:p>
+    <w:p>
+      <w:pPr>
+        <w:pStyle w:val="Heading2"/>
+      </w:pPr>
+      <w:r>
+        <w:rPr/>
+        <w:t xml:space="preserve">6.5 Evaluación con ambos datasets</w:t>
+      </w:r>
+    </w:p>
+    <w:p>
+      <w:pPr>
+        <w:spacing w:after="120"/>
+      </w:pPr>
+      <w:r>
+        <w:rPr/>
+        <w:t xml:space="preserve">La consigna pide evaluar las corridas con los dos datasets. Se corrió el sistema completo sobre cada uno con la misma configuración (K = 4, ρ = 0,65) y se midió sobre el 20% reservado. El detalle está en el </w:t>
+      </w:r>
+      <w:r>
+        <w:rPr>
+          <w:b/>
+          <w:bCs/>
+        </w:rPr>
+        <w:t xml:space="preserve">informe evaluativo</w:t>
+      </w:r>
+      <w:r>
+        <w:rPr/>
+        <w:t xml:space="preserve"> (docs/Informe_evaluativo_TFI.docx).</w:t>
+      </w:r>
+    </w:p>
+    <w:tbl>
+      <w:tblPr>
+        <w:tblW w:type="dxa" w:w="9026"/>
+        <w:tblLayout w:type="fixed"/>
+      </w:tblPr>
+      <w:tblGrid>
+        <w:gridCol w:w="4026"/>
+        <w:gridCol w:w="2500"/>
+        <w:gridCol w:w="2500"/>
+      </w:tblGrid>
+      <w:tr>
+        <w:trPr>
+          <w:tblHeader/>
+        </w:trPr>
+        <w:tc>
+          <w:tcPr>
+            <w:tcW w:type="dxa" w:w="4026"/>
+            <w:tcBorders>
+              <w:top w:val="single" w:color="BBBBBB" w:sz="4"/>
+              <w:left w:val="single" w:color="BBBBBB" w:sz="4"/>
+              <w:bottom w:val="single" w:color="BBBBBB" w:sz="4"/>
+              <w:right w:val="single" w:color="BBBBBB" w:sz="4"/>
+            </w:tcBorders>
+            <w:shd w:fill="1F3864" w:color="auto" w:val="clear"/>
+            <w:tcMar>
+              <w:top w:type="dxa" w:w="50"/>
+              <w:left w:type="dxa" w:w="90"/>
+              <w:bottom w:type="dxa" w:w="50"/>
+              <w:right w:type="dxa" w:w="90"/>
+            </w:tcMar>
+          </w:tcPr>
+          <w:p>
+            <w:r>
+              <w:rPr>
+                <w:b/>
+                <w:bCs/>
+                <w:color w:val="FFFFFF"/>
+                <w:sz w:val="18"/>
+                <w:szCs w:val="18"/>
+              </w:rPr>
+              <w:t xml:space="preserve">Métrica</w:t>
+            </w:r>
+          </w:p>
+        </w:tc>
+        <w:tc>
+          <w:tcPr>
+            <w:tcW w:type="dxa" w:w="2500"/>
+            <w:tcBorders>
+              <w:top w:val="single" w:color="BBBBBB" w:sz="4"/>
+              <w:left w:val="single" w:color="BBBBBB" w:sz="4"/>
+              <w:bottom w:val="single" w:color="BBBBBB" w:sz="4"/>
+              <w:right w:val="single" w:color="BBBBBB" w:sz="4"/>
+            </w:tcBorders>
+            <w:shd w:fill="1F3864" w:color="auto" w:val="clear"/>
+            <w:tcMar>
+              <w:top w:type="dxa" w:w="50"/>
+              <w:left w:type="dxa" w:w="90"/>
+              <w:bottom w:type="dxa" w:w="50"/>
+              <w:right w:type="dxa" w:w="90"/>
+            </w:tcMar>
+          </w:tcPr>
+          <w:p>
+            <w:r>
+              <w:rPr>
+                <w:b/>
+                <w:bCs/>
+                <w:color w:val="FFFFFF"/>
+                <w:sz w:val="18"/>
+                <w:szCs w:val="18"/>
+              </w:rPr>
+              <w:t xml:space="preserve">Dataset 1 · simulado</w:t>
+            </w:r>
+          </w:p>
+        </w:tc>
+        <w:tc>
+          <w:tcPr>
+            <w:tcW w:type="dxa" w:w="2500"/>
+            <w:tcBorders>
+              <w:top w:val="single" w:color="BBBBBB" w:sz="4"/>
+              <w:left w:val="single" w:color="BBBBBB" w:sz="4"/>
+              <w:bottom w:val="single" w:color="BBBBBB" w:sz="4"/>
+              <w:right w:val="single" w:color="BBBBBB" w:sz="4"/>
+            </w:tcBorders>
+            <w:shd w:fill="1F3864" w:color="auto" w:val="clear"/>
+            <w:tcMar>
+              <w:top w:type="dxa" w:w="50"/>
+              <w:left w:type="dxa" w:w="90"/>
+              <w:bottom w:type="dxa" w:w="50"/>
+              <w:right w:type="dxa" w:w="90"/>
+            </w:tcMar>
+          </w:tcPr>
+          <w:p>
+            <w:r>
+              <w:rPr>
+                <w:b/>
+                <w:bCs/>
+                <w:color w:val="FFFFFF"/>
+                <w:sz w:val="18"/>
+                <w:szCs w:val="18"/>
+              </w:rPr>
+              <w:t xml:space="preserve">Dataset 2 · Factors</w:t>
+            </w:r>
+          </w:p>
+        </w:tc>
+      </w:tr>
+      <w:tr>
+        <w:trPr>
+          <w:cantSplit/>
+        </w:trPr>
+        <w:tc>
+          <w:tcPr>
+            <w:tcW w:type="dxa" w:w="4026"/>
+            <w:tcBorders>
+              <w:top w:val="single" w:color="BBBBBB" w:sz="4"/>
+              <w:left w:val="single" w:color="BBBBBB" w:sz="4"/>
+              <w:bottom w:val="single" w:color="BBBBBB" w:sz="4"/>
+              <w:right w:val="single" w:color="BBBBBB" w:sz="4"/>
+            </w:tcBorders>
+            <w:tcMar>
+              <w:top w:type="dxa" w:w="50"/>
+              <w:left w:type="dxa" w:w="90"/>
+              <w:bottom w:type="dxa" w:w="50"/>
+              <w:right w:type="dxa" w:w="90"/>
+            </w:tcMar>
+          </w:tcPr>
+          <w:p>
+            <w:r>
+              <w:rPr>
+                <w:b/>
+                <w:bCs/>
+                <w:sz w:val="18"/>
+                <w:szCs w:val="18"/>
+              </w:rPr>
+              <w:t xml:space="preserve">BIC con mínimo en K = 4</w:t>
+            </w:r>
+          </w:p>
+        </w:tc>
+        <w:tc>
+          <w:tcPr>
+            <w:tcW w:type="dxa" w:w="2500"/>
+            <w:tcBorders>
+              <w:top w:val="single" w:color="BBBBBB" w:sz="4"/>
+              <w:left w:val="single" w:color="BBBBBB" w:sz="4"/>
+              <w:bottom w:val="single" w:color="BBBBBB" w:sz="4"/>
+              <w:right w:val="single" w:color="BBBBBB" w:sz="4"/>
+            </w:tcBorders>
+            <w:shd w:fill="E2EFDA" w:color="auto" w:val="clear"/>
+            <w:tcMar>
+              <w:top w:type="dxa" w:w="50"/>
+              <w:left w:type="dxa" w:w="90"/>
+              <w:bottom w:type="dxa" w:w="50"/>
+              <w:right w:type="dxa" w:w="90"/>
+            </w:tcMar>
+          </w:tcPr>
+          <w:p>
+            <w:r>
+              <w:rPr>
+                <w:sz w:val="18"/>
+                <w:szCs w:val="18"/>
+              </w:rPr>
+              <w:t xml:space="preserve">Sí</w:t>
+            </w:r>
+          </w:p>
+        </w:tc>
+        <w:tc>
+          <w:tcPr>
+            <w:tcW w:type="dxa" w:w="2500"/>
+            <w:tcBorders>
+              <w:top w:val="single" w:color="BBBBBB" w:sz="4"/>
+              <w:left w:val="single" w:color="BBBBBB" w:sz="4"/>
+              <w:bottom w:val="single" w:color="BBBBBB" w:sz="4"/>
+              <w:right w:val="single" w:color="BBBBBB" w:sz="4"/>
+            </w:tcBorders>
+            <w:shd w:fill="FCE4D6" w:color="auto" w:val="clear"/>
+            <w:tcMar>
+              <w:top w:type="dxa" w:w="50"/>
+              <w:left w:type="dxa" w:w="90"/>
+              <w:bottom w:type="dxa" w:w="50"/>
+              <w:right w:type="dxa" w:w="90"/>
+            </w:tcMar>
+          </w:tcPr>
+          <w:p>
+            <w:r>
+              <w:rPr>
+                <w:sz w:val="18"/>
+                <w:szCs w:val="18"/>
+              </w:rPr>
+              <w:t xml:space="preserve">No (baja hasta K = 7)</w:t>
+            </w:r>
+          </w:p>
+        </w:tc>
+      </w:tr>
+      <w:tr>
+        <w:trPr>
+          <w:cantSplit/>
+        </w:trPr>
+        <w:tc>
+          <w:tcPr>
+            <w:tcW w:type="dxa" w:w="4026"/>
+            <w:tcBorders>
+              <w:top w:val="single" w:color="BBBBBB" w:sz="4"/>
+              <w:left w:val="single" w:color="BBBBBB" w:sz="4"/>
+              <w:bottom w:val="single" w:color="BBBBBB" w:sz="4"/>
+              <w:right w:val="single" w:color="BBBBBB" w:sz="4"/>
+            </w:tcBorders>
+            <w:tcMar>
+              <w:top w:type="dxa" w:w="50"/>
+              <w:left w:type="dxa" w:w="90"/>
+              <w:bottom w:type="dxa" w:w="50"/>
+              <w:right w:type="dxa" w:w="90"/>
+            </w:tcMar>
+          </w:tcPr>
+          <w:p>
+            <w:r>
+              <w:rPr>
+                <w:b/>
+                <w:bCs/>
+                <w:sz w:val="18"/>
+                <w:szCs w:val="18"/>
+              </w:rPr>
+              <w:t xml:space="preserve">Pureza / CR (metas ≥ 80% y 0,05–0,20)</w:t>
+            </w:r>
+          </w:p>
+        </w:tc>
+        <w:tc>
+          <w:tcPr>
+            <w:tcW w:type="dxa" w:w="2500"/>
+            <w:tcBorders>
+              <w:top w:val="single" w:color="BBBBBB" w:sz="4"/>
+              <w:left w:val="single" w:color="BBBBBB" w:sz="4"/>
+              <w:bottom w:val="single" w:color="BBBBBB" w:sz="4"/>
+              <w:right w:val="single" w:color="BBBBBB" w:sz="4"/>
+            </w:tcBorders>
+            <w:shd w:fill="E2EFDA" w:color="auto" w:val="clear"/>
+            <w:tcMar>
+              <w:top w:type="dxa" w:w="50"/>
+              <w:left w:type="dxa" w:w="90"/>
+              <w:bottom w:type="dxa" w:w="50"/>
+              <w:right w:type="dxa" w:w="90"/>
+            </w:tcMar>
+          </w:tcPr>
+          <w:p>
+            <w:r>
+              <w:rPr>
+                <w:sz w:val="18"/>
+                <w:szCs w:val="18"/>
+              </w:rPr>
+              <w:t xml:space="preserve">81,4% / 0,109</w:t>
+            </w:r>
+          </w:p>
+        </w:tc>
+        <w:tc>
+          <w:tcPr>
+            <w:tcW w:type="dxa" w:w="2500"/>
+            <w:tcBorders>
+              <w:top w:val="single" w:color="BBBBBB" w:sz="4"/>
+              <w:left w:val="single" w:color="BBBBBB" w:sz="4"/>
+              <w:bottom w:val="single" w:color="BBBBBB" w:sz="4"/>
+              <w:right w:val="single" w:color="BBBBBB" w:sz="4"/>
+            </w:tcBorders>
+            <w:shd w:fill="E2EFDA" w:color="auto" w:val="clear"/>
+            <w:tcMar>
+              <w:top w:type="dxa" w:w="50"/>
+              <w:left w:type="dxa" w:w="90"/>
+              <w:bottom w:type="dxa" w:w="50"/>
+              <w:right w:type="dxa" w:w="90"/>
+            </w:tcMar>
+          </w:tcPr>
+          <w:p>
+            <w:r>
+              <w:rPr>
+                <w:sz w:val="18"/>
+                <w:szCs w:val="18"/>
+              </w:rPr>
+              <w:t xml:space="preserve">84,6% / 0,074</w:t>
+            </w:r>
+          </w:p>
+        </w:tc>
+      </w:tr>
+      <w:tr>
+        <w:trPr>
+          <w:cantSplit/>
+        </w:trPr>
+        <w:tc>
+          <w:tcPr>
+            <w:tcW w:type="dxa" w:w="4026"/>
+            <w:tcBorders>
+              <w:top w:val="single" w:color="BBBBBB" w:sz="4"/>
+              <w:left w:val="single" w:color="BBBBBB" w:sz="4"/>
+              <w:bottom w:val="single" w:color="BBBBBB" w:sz="4"/>
+              <w:right w:val="single" w:color="BBBBBB" w:sz="4"/>
+            </w:tcBorders>
+            <w:tcMar>
+              <w:top w:type="dxa" w:w="50"/>
+              <w:left w:type="dxa" w:w="90"/>
+              <w:bottom w:type="dxa" w:w="50"/>
+              <w:right w:type="dxa" w:w="90"/>
+            </w:tcMar>
+          </w:tcPr>
+          <w:p>
+            <w:r>
+              <w:rPr>
+                <w:b/>
+                <w:bCs/>
+                <w:sz w:val="18"/>
+                <w:szCs w:val="18"/>
+              </w:rPr>
+              <w:t xml:space="preserve">MAE del sistema</w:t>
+            </w:r>
+          </w:p>
+        </w:tc>
+        <w:tc>
+          <w:tcPr>
+            <w:tcW w:type="dxa" w:w="2500"/>
+            <w:tcBorders>
+              <w:top w:val="single" w:color="BBBBBB" w:sz="4"/>
+              <w:left w:val="single" w:color="BBBBBB" w:sz="4"/>
+              <w:bottom w:val="single" w:color="BBBBBB" w:sz="4"/>
+              <w:right w:val="single" w:color="BBBBBB" w:sz="4"/>
+            </w:tcBorders>
+            <w:shd w:fill="E2EFDA" w:color="auto" w:val="clear"/>
+            <w:tcMar>
+              <w:top w:type="dxa" w:w="50"/>
+              <w:left w:type="dxa" w:w="90"/>
+              <w:bottom w:type="dxa" w:w="50"/>
+              <w:right w:type="dxa" w:w="90"/>
+            </w:tcMar>
+          </w:tcPr>
+          <w:p>
+            <w:r>
+              <w:rPr>
+                <w:sz w:val="18"/>
+                <w:szCs w:val="18"/>
+              </w:rPr>
+              <w:t xml:space="preserve">0,94</w:t>
+            </w:r>
+          </w:p>
+        </w:tc>
+        <w:tc>
+          <w:tcPr>
+            <w:tcW w:type="dxa" w:w="2500"/>
+            <w:tcBorders>
+              <w:top w:val="single" w:color="BBBBBB" w:sz="4"/>
+              <w:left w:val="single" w:color="BBBBBB" w:sz="4"/>
+              <w:bottom w:val="single" w:color="BBBBBB" w:sz="4"/>
+              <w:right w:val="single" w:color="BBBBBB" w:sz="4"/>
+            </w:tcBorders>
+            <w:shd w:fill="E2EFDA" w:color="auto" w:val="clear"/>
+            <w:tcMar>
+              <w:top w:type="dxa" w:w="50"/>
+              <w:left w:type="dxa" w:w="90"/>
+              <w:bottom w:type="dxa" w:w="50"/>
+              <w:right w:type="dxa" w:w="90"/>
+            </w:tcMar>
+          </w:tcPr>
+          <w:p>
+            <w:r>
+              <w:rPr>
+                <w:sz w:val="18"/>
+                <w:szCs w:val="18"/>
+              </w:rPr>
+              <w:t xml:space="preserve">0,23</w:t>
+            </w:r>
+          </w:p>
+        </w:tc>
+      </w:tr>
+      <w:tr>
+        <w:trPr>
+          <w:cantSplit/>
+        </w:trPr>
+        <w:tc>
+          <w:tcPr>
+            <w:tcW w:type="dxa" w:w="4026"/>
+            <w:tcBorders>
+              <w:top w:val="single" w:color="BBBBBB" w:sz="4"/>
+              <w:left w:val="single" w:color="BBBBBB" w:sz="4"/>
+              <w:bottom w:val="single" w:color="BBBBBB" w:sz="4"/>
+              <w:right w:val="single" w:color="BBBBBB" w:sz="4"/>
+            </w:tcBorders>
+            <w:tcMar>
+              <w:top w:type="dxa" w:w="50"/>
+              <w:left w:type="dxa" w:w="90"/>
+              <w:bottom w:type="dxa" w:w="50"/>
+              <w:right w:type="dxa" w:w="90"/>
+            </w:tcMar>
+          </w:tcPr>
+          <w:p>
+            <w:r>
+              <w:rPr>
+                <w:b/>
+                <w:bCs/>
+                <w:sz w:val="18"/>
+                <w:szCs w:val="18"/>
+              </w:rPr>
+              <w:t xml:space="preserve">MAE prediciendo la media / solo EM</w:t>
+            </w:r>
+          </w:p>
+        </w:tc>
+        <w:tc>
+          <w:tcPr>
+            <w:tcW w:type="dxa" w:w="2500"/>
+            <w:tcBorders>
+              <w:top w:val="single" w:color="BBBBBB" w:sz="4"/>
+              <w:left w:val="single" w:color="BBBBBB" w:sz="4"/>
+              <w:bottom w:val="single" w:color="BBBBBB" w:sz="4"/>
+              <w:right w:val="single" w:color="BBBBBB" w:sz="4"/>
+            </w:tcBorders>
+            <w:tcMar>
+              <w:top w:type="dxa" w:w="50"/>
+              <w:left w:type="dxa" w:w="90"/>
+              <w:bottom w:type="dxa" w:w="50"/>
+              <w:right w:type="dxa" w:w="90"/>
+            </w:tcMar>
+          </w:tcPr>
+          <w:p>
+            <w:r>
+              <w:rPr>
+                <w:sz w:val="18"/>
+                <w:szCs w:val="18"/>
+              </w:rPr>
+              <w:t xml:space="preserve">1,33 / 0,99</w:t>
+            </w:r>
+          </w:p>
+        </w:tc>
+        <w:tc>
+          <w:tcPr>
+            <w:tcW w:type="dxa" w:w="2500"/>
+            <w:tcBorders>
+              <w:top w:val="single" w:color="BBBBBB" w:sz="4"/>
+              <w:left w:val="single" w:color="BBBBBB" w:sz="4"/>
+              <w:bottom w:val="single" w:color="BBBBBB" w:sz="4"/>
+              <w:right w:val="single" w:color="BBBBBB" w:sz="4"/>
+            </w:tcBorders>
+            <w:tcMar>
+              <w:top w:type="dxa" w:w="50"/>
+              <w:left w:type="dxa" w:w="90"/>
+              <w:bottom w:type="dxa" w:w="50"/>
+              <w:right w:type="dxa" w:w="90"/>
+            </w:tcMar>
+          </w:tcPr>
+          <w:p>
+            <w:r>
+              <w:rPr>
+                <w:sz w:val="18"/>
+                <w:szCs w:val="18"/>
+              </w:rPr>
+              <w:t xml:space="preserve">0,29 / 0,24</w:t>
+            </w:r>
+          </w:p>
+        </w:tc>
+      </w:tr>
+      <w:tr>
+        <w:trPr>
+          <w:cantSplit/>
+        </w:trPr>
+        <w:tc>
+          <w:tcPr>
+            <w:tcW w:type="dxa" w:w="4026"/>
+            <w:tcBorders>
+              <w:top w:val="single" w:color="BBBBBB" w:sz="4"/>
+              <w:left w:val="single" w:color="BBBBBB" w:sz="4"/>
+              <w:bottom w:val="single" w:color="BBBBBB" w:sz="4"/>
+              <w:right w:val="single" w:color="BBBBBB" w:sz="4"/>
+            </w:tcBorders>
+            <w:tcMar>
+              <w:top w:type="dxa" w:w="50"/>
+              <w:left w:type="dxa" w:w="90"/>
+              <w:bottom w:type="dxa" w:w="50"/>
+              <w:right w:type="dxa" w:w="90"/>
+            </w:tcMar>
+          </w:tcPr>
+          <w:p>
+            <w:r>
+              <w:rPr>
+                <w:b/>
+                <w:bCs/>
+                <w:sz w:val="18"/>
+                <w:szCs w:val="18"/>
+              </w:rPr>
+              <w:t xml:space="preserve">Acierto de categoría</w:t>
+            </w:r>
+          </w:p>
+        </w:tc>
+        <w:tc>
+          <w:tcPr>
+            <w:tcW w:type="dxa" w:w="2500"/>
+            <w:tcBorders>
+              <w:top w:val="single" w:color="BBBBBB" w:sz="4"/>
+              <w:left w:val="single" w:color="BBBBBB" w:sz="4"/>
+              <w:bottom w:val="single" w:color="BBBBBB" w:sz="4"/>
+              <w:right w:val="single" w:color="BBBBBB" w:sz="4"/>
+            </w:tcBorders>
+            <w:shd w:fill="E2EFDA" w:color="auto" w:val="clear"/>
+            <w:tcMar>
+              <w:top w:type="dxa" w:w="50"/>
+              <w:left w:type="dxa" w:w="90"/>
+              <w:bottom w:type="dxa" w:w="50"/>
+              <w:right w:type="dxa" w:w="90"/>
+            </w:tcMar>
+          </w:tcPr>
+          <w:p>
+            <w:r>
+              <w:rPr>
+                <w:sz w:val="18"/>
+                <w:szCs w:val="18"/>
+              </w:rPr>
+              <w:t xml:space="preserve">57,2%</w:t>
+            </w:r>
+          </w:p>
+        </w:tc>
+        <w:tc>
+          <w:tcPr>
+            <w:tcW w:type="dxa" w:w="2500"/>
+            <w:tcBorders>
+              <w:top w:val="single" w:color="BBBBBB" w:sz="4"/>
+              <w:left w:val="single" w:color="BBBBBB" w:sz="4"/>
+              <w:bottom w:val="single" w:color="BBBBBB" w:sz="4"/>
+              <w:right w:val="single" w:color="BBBBBB" w:sz="4"/>
+            </w:tcBorders>
+            <w:shd w:fill="FCE4D6" w:color="auto" w:val="clear"/>
+            <w:tcMar>
+              <w:top w:type="dxa" w:w="50"/>
+              <w:left w:type="dxa" w:w="90"/>
+              <w:bottom w:type="dxa" w:w="50"/>
+              <w:right w:type="dxa" w:w="90"/>
+            </w:tcMar>
+          </w:tcPr>
+          <w:p>
+            <w:r>
+              <w:rPr>
+                <w:sz w:val="18"/>
+                <w:szCs w:val="18"/>
+              </w:rPr>
+              <w:t xml:space="preserve">98,0%</w:t>
+            </w:r>
+          </w:p>
+        </w:tc>
+      </w:tr>
+      <w:tr>
+        <w:trPr>
+          <w:cantSplit/>
+        </w:trPr>
+        <w:tc>
+          <w:tcPr>
+            <w:tcW w:type="dxa" w:w="4026"/>
+            <w:tcBorders>
+              <w:top w:val="single" w:color="BBBBBB" w:sz="4"/>
+              <w:left w:val="single" w:color="BBBBBB" w:sz="4"/>
+              <w:bottom w:val="single" w:color="BBBBBB" w:sz="4"/>
+              <w:right w:val="single" w:color="BBBBBB" w:sz="4"/>
+            </w:tcBorders>
+            <w:tcMar>
+              <w:top w:type="dxa" w:w="50"/>
+              <w:left w:type="dxa" w:w="90"/>
+              <w:bottom w:type="dxa" w:w="50"/>
+              <w:right w:type="dxa" w:w="90"/>
+            </w:tcMar>
+          </w:tcPr>
+          <w:p>
+            <w:r>
+              <w:rPr>
+                <w:b/>
+                <w:bCs/>
+                <w:sz w:val="18"/>
+                <w:szCs w:val="18"/>
+              </w:rPr>
+              <w:t xml:space="preserve">Acierto diciendo siempre la más común</w:t>
+            </w:r>
+          </w:p>
+        </w:tc>
+        <w:tc>
+          <w:tcPr>
+            <w:tcW w:type="dxa" w:w="2500"/>
+            <w:tcBorders>
+              <w:top w:val="single" w:color="BBBBBB" w:sz="4"/>
+              <w:left w:val="single" w:color="BBBBBB" w:sz="4"/>
+              <w:bottom w:val="single" w:color="BBBBBB" w:sz="4"/>
+              <w:right w:val="single" w:color="BBBBBB" w:sz="4"/>
+            </w:tcBorders>
+            <w:tcMar>
+              <w:top w:type="dxa" w:w="50"/>
+              <w:left w:type="dxa" w:w="90"/>
+              <w:bottom w:type="dxa" w:w="50"/>
+              <w:right w:type="dxa" w:w="90"/>
+            </w:tcMar>
+          </w:tcPr>
+          <w:p>
+            <w:r>
+              <w:rPr>
+                <w:sz w:val="18"/>
+                <w:szCs w:val="18"/>
+              </w:rPr>
+              <w:t xml:space="preserve">43,0%</w:t>
+            </w:r>
+          </w:p>
+        </w:tc>
+        <w:tc>
+          <w:tcPr>
+            <w:tcW w:type="dxa" w:w="2500"/>
+            <w:tcBorders>
+              <w:top w:val="single" w:color="BBBBBB" w:sz="4"/>
+              <w:left w:val="single" w:color="BBBBBB" w:sz="4"/>
+              <w:bottom w:val="single" w:color="BBBBBB" w:sz="4"/>
+              <w:right w:val="single" w:color="BBBBBB" w:sz="4"/>
+            </w:tcBorders>
+            <w:tcMar>
+              <w:top w:type="dxa" w:w="50"/>
+              <w:left w:type="dxa" w:w="90"/>
+              <w:bottom w:type="dxa" w:w="50"/>
+              <w:right w:type="dxa" w:w="90"/>
+            </w:tcMar>
+          </w:tcPr>
+          <w:p>
+            <w:r>
+              <w:rPr>
+                <w:sz w:val="18"/>
+                <w:szCs w:val="18"/>
+              </w:rPr>
+              <w:t xml:space="preserve">98,0%</w:t>
+            </w:r>
+          </w:p>
+        </w:tc>
+      </w:tr>
+    </w:tbl>
+    <w:p>
+      <w:pPr>
+        <w:spacing w:after="60"/>
+      </w:pPr>
+    </w:p>
+    <w:p>
+      <w:pPr>
+        <w:pStyle w:val="ListParagraph"/>
+        <w:numPr>
+          <w:ilvl w:val="0"/>
+          <w:numId w:val="2"/>
+        </w:numPr>
+        <w:spacing w:after="60"/>
+      </w:pPr>
+      <w:r>
+        <w:rPr>
+          <w:b/>
+          <w:bCs/>
+        </w:rPr>
+        <w:t xml:space="preserve">La arquitectura es portable:</w:t>
+      </w:r>
+      <w:r>
+        <w:rPr/>
+        <w:t xml:space="preserve"> con la misma configuración cumple pureza y CR en los dos datasets y siempre predice mejor que las referencias (−30% y −24% de error frente a la media).</w:t>
+      </w:r>
+    </w:p>
+    <w:p>
+      <w:pPr>
+        <w:pStyle w:val="ListParagraph"/>
+        <w:numPr>
+          <w:ilvl w:val="0"/>
+          <w:numId w:val="2"/>
+        </w:numPr>
+        <w:spacing w:after="60"/>
+      </w:pPr>
+      <w:r>
+        <w:rPr>
+          <w:b/>
+          <w:bCs/>
+        </w:rPr>
+        <w:t xml:space="preserve">El dataset 1 es el que permite evaluar:</w:t>
+      </w:r>
+      <w:r>
+        <w:rPr/>
+        <w:t xml:space="preserve"> tiene notas en las cuatro categorías y el sistema supera claramente a decir siempre la categoría más común (57% contra 43%).</w:t>
+      </w:r>
+    </w:p>
+    <w:p>
+      <w:pPr>
+        <w:pStyle w:val="ListParagraph"/>
+        <w:numPr>
+          <w:ilvl w:val="0"/>
+          <w:numId w:val="2"/>
+        </w:numPr>
+        <w:spacing w:after="60"/>
+      </w:pPr>
+      <w:r>
+        <w:rPr>
+          <w:b/>
+          <w:bCs/>
+        </w:rPr>
+        <w:t xml:space="preserve">El dataset 2 aporta poco:</w:t>
+      </w:r>
+      <w:r>
+        <w:rPr/>
+        <w:t xml:space="preserve"> el 98% de los alumnos es Aprobado Regular y la nota esperada solo va de 6,1 a 7,8, así que su 98% de acierto es trivial. Confirma que el pipeline corre con otros datos, no que prediga categorías.</w:t>
       </w:r>
     </w:p>
     <w:p>
@@ -11751,119 +12472,1473 @@
         <w:pStyle w:val="Heading1"/>
       </w:pPr>
       <w:r>
-        <w:t xml:space="preserve">10. Limitaciones</w:t>
-      </w:r>
-    </w:p>
-    <w:p>
-      <w:pPr>
-        <w:pStyle w:val="ListParagraph"/>
-        <w:numPr>
-          <w:ilvl w:val="0"/>
-          <w:numId w:val="2"/>
-        </w:numPr>
-        <w:spacing w:after="60"/>
-      </w:pPr>
+        <w:t>10. Alcance y limitaciones</w:t>
+      </w:r>
+    </w:p>
+    <w:p>
+      <w:pPr>
+        <w:spacing w:after="120"/>
+      </w:pPr>
+      <w:r>
+        <w:rPr>
+          <w:sz w:val="20"/>
+          <w:szCs w:val="20"/>
+        </w:rPr>
+        <w:t xml:space="preserve">Esta sección junta en un solo lugar qué hace el sistema, qué deja afuera a propósito y cuáles son sus puntos débiles conocidos. Los números salen de correr </w:t>
+      </w:r>
       <w:r>
         <w:rPr>
           <w:b/>
           <w:bCs/>
-        </w:rPr>
-        <w:t xml:space="preserve">Silhouette 0,19</w:t>
-      </w:r>
-      <w:r>
-        <w:t xml:space="preserve">, por debajo del objetivo de 0,40: los perfiles se solapan (así se simularon) y el EM sobre la escala real queda dominado por asistencia y nota previa, que tienen más dispersión. La coincidencia con los perfiles latentes es baja (ARI 0,20).</w:t>
-      </w:r>
-    </w:p>
-    <w:p>
-      <w:pPr>
-        <w:pStyle w:val="ListParagraph"/>
-        <w:numPr>
-          <w:ilvl w:val="0"/>
-          <w:numId w:val="2"/>
-        </w:numPr>
-        <w:spacing w:after="60"/>
-      </w:pPr>
-      <w:r>
-        <w:rPr>
-          <w:bCs/>
-        </w:rPr>
-        <w:t xml:space="preserve">Acierto de categoría 57%, aunque el error en la nota es bajo: muchos alumnos están cerca de los límites y los extremos se suavizan (detecta el 30% de Promoción y el 19% de Desaprobado). Ver sección 6.4.</w:t>
-      </w:r>
-    </w:p>
-    <w:p>
-      <w:pPr>
-        <w:pStyle w:val="ListParagraph"/>
-        <w:numPr>
-          <w:ilvl w:val="0"/>
-          <w:numId w:val="2"/>
-        </w:numPr>
-        <w:spacing w:after="60"/>
-      </w:pPr>
-      <w:r>
-        <w:rPr>
-          <w:bCs/>
-        </w:rPr>
-        <w:t>La nota no es monótona en cada variable: mejorar un hábito puede bajar la nota esperada (17,7% de los casos, más de 0,3 puntos), porque ART 1 compara bits y el código binario posicional no es ordinal. Se mantiene el modelo (D-17). Ver sección 6.4.</w:t>
-      </w:r>
-    </w:p>
-    <w:p>
-      <w:pPr>
-        <w:pStyle w:val="ListParagraph"/>
-        <w:numPr>
-          <w:ilvl w:val="0"/>
-          <w:numId w:val="2"/>
-        </w:numPr>
-        <w:spacing w:after="60"/>
+          <w:sz w:val="20"/>
+          <w:szCs w:val="20"/>
+        </w:rPr>
+        <w:t xml:space="preserve">python -m src.metrics</w:t>
+      </w:r>
+      <w:r>
+        <w:rPr>
+          <w:sz w:val="20"/>
+          <w:szCs w:val="20"/>
+        </w:rPr>
+        <w:t xml:space="preserve"> con ρ = 0,65 y K = 4 (sección 6.4).</w:t>
+      </w:r>
+    </w:p>
+    <w:p>
+      <w:pPr>
+        <w:pStyle w:val="Heading2"/>
+      </w:pPr>
+      <w:r>
+        <w:t xml:space="preserve">10.1 Alcance</w:t>
+      </w:r>
+    </w:p>
+    <w:tbl>
+      <w:tblPr>
+        <w:tblW w:type="dxa" w:w="9026"/>
+        <w:tblBorders>
+          <w:top w:val="single" w:color="auto" w:sz="4"/>
+          <w:left w:val="single" w:color="auto" w:sz="4"/>
+          <w:bottom w:val="single" w:color="auto" w:sz="4"/>
+          <w:right w:val="single" w:color="auto" w:sz="4"/>
+          <w:insideH w:val="single" w:color="auto" w:sz="4"/>
+          <w:insideV w:val="single" w:color="auto" w:sz="4"/>
+        </w:tblBorders>
+      </w:tblPr>
+      <w:tblGrid>
+        <w:gridCol w:w="2000"/>
+        <w:gridCol w:w="4300"/>
+        <w:gridCol w:w="2726"/>
+      </w:tblGrid>
+      <w:tr>
+        <w:trPr>
+          <w:tblHeader/>
+        </w:trPr>
+        <w:tc>
+          <w:tcPr>
+            <w:tcW w:type="dxa" w:w="2000"/>
+            <w:tcBorders>
+              <w:top w:val="single" w:color="BBBBBB" w:sz="4"/>
+              <w:left w:val="single" w:color="BBBBBB" w:sz="4"/>
+              <w:bottom w:val="single" w:color="BBBBBB" w:sz="4"/>
+              <w:right w:val="single" w:color="BBBBBB" w:sz="4"/>
+            </w:tcBorders>
+            <w:shd w:fill="1F3864" w:color="auto" w:val="clear"/>
+            <w:tcMar>
+              <w:top w:type="dxa" w:w="50"/>
+              <w:left w:type="dxa" w:w="90"/>
+              <w:bottom w:type="dxa" w:w="50"/>
+              <w:right w:type="dxa" w:w="90"/>
+            </w:tcMar>
+          </w:tcPr>
+          <w:p>
+            <w:r>
+              <w:rPr>
+                <w:b/>
+                <w:bCs/>
+                <w:color w:val="FFFFFF"/>
+                <w:sz w:val="18"/>
+                <w:szCs w:val="18"/>
+              </w:rPr>
+              <w:t xml:space="preserve">Tema</w:t>
+            </w:r>
+          </w:p>
+        </w:tc>
+        <w:tc>
+          <w:tcPr>
+            <w:tcW w:type="dxa" w:w="4300"/>
+            <w:tcBorders>
+              <w:top w:val="single" w:color="BBBBBB" w:sz="4"/>
+              <w:left w:val="single" w:color="BBBBBB" w:sz="4"/>
+              <w:bottom w:val="single" w:color="BBBBBB" w:sz="4"/>
+              <w:right w:val="single" w:color="BBBBBB" w:sz="4"/>
+            </w:tcBorders>
+            <w:shd w:fill="1F3864" w:color="auto" w:val="clear"/>
+            <w:tcMar>
+              <w:top w:type="dxa" w:w="50"/>
+              <w:left w:type="dxa" w:w="90"/>
+              <w:bottom w:type="dxa" w:w="50"/>
+              <w:right w:type="dxa" w:w="90"/>
+            </w:tcMar>
+          </w:tcPr>
+          <w:p>
+            <w:r>
+              <w:rPr>
+                <w:b/>
+                <w:bCs/>
+                <w:color w:val="FFFFFF"/>
+                <w:sz w:val="18"/>
+                <w:szCs w:val="18"/>
+              </w:rPr>
+              <w:t xml:space="preserve">Dentro del alcance</w:t>
+            </w:r>
+          </w:p>
+        </w:tc>
+        <w:tc>
+          <w:tcPr>
+            <w:tcW w:type="dxa" w:w="2726"/>
+            <w:tcBorders>
+              <w:top w:val="single" w:color="BBBBBB" w:sz="4"/>
+              <w:left w:val="single" w:color="BBBBBB" w:sz="4"/>
+              <w:bottom w:val="single" w:color="BBBBBB" w:sz="4"/>
+              <w:right w:val="single" w:color="BBBBBB" w:sz="4"/>
+            </w:tcBorders>
+            <w:shd w:fill="1F3864" w:color="auto" w:val="clear"/>
+            <w:tcMar>
+              <w:top w:type="dxa" w:w="50"/>
+              <w:left w:type="dxa" w:w="90"/>
+              <w:bottom w:type="dxa" w:w="50"/>
+              <w:right w:type="dxa" w:w="90"/>
+            </w:tcMar>
+          </w:tcPr>
+          <w:p>
+            <w:r>
+              <w:rPr>
+                <w:b/>
+                <w:bCs/>
+                <w:color w:val="FFFFFF"/>
+                <w:sz w:val="18"/>
+                <w:szCs w:val="18"/>
+              </w:rPr>
+              <w:t xml:space="preserve">Fuera del alcance</w:t>
+            </w:r>
+          </w:p>
+        </w:tc>
+      </w:tr>
+      <w:tr>
+        <w:tc>
+          <w:tcPr>
+            <w:tcW w:type="dxa" w:w="2000"/>
+            <w:tcBorders>
+              <w:top w:val="single" w:color="BBBBBB" w:sz="4"/>
+              <w:left w:val="single" w:color="BBBBBB" w:sz="4"/>
+              <w:bottom w:val="single" w:color="BBBBBB" w:sz="4"/>
+              <w:right w:val="single" w:color="BBBBBB" w:sz="4"/>
+            </w:tcBorders>
+            <w:tcMar>
+              <w:top w:type="dxa" w:w="50"/>
+              <w:left w:type="dxa" w:w="90"/>
+              <w:bottom w:type="dxa" w:w="50"/>
+              <w:right w:type="dxa" w:w="90"/>
+            </w:tcMar>
+          </w:tcPr>
+          <w:p>
+            <w:r>
+              <w:rPr>
+                <w:b/>
+                <w:bCs/>
+                <w:sz w:val="18"/>
+                <w:szCs w:val="18"/>
+              </w:rPr>
+              <w:t xml:space="preserve">Qué predice</w:t>
+            </w:r>
+          </w:p>
+        </w:tc>
+        <w:tc>
+          <w:tcPr>
+            <w:tcW w:type="dxa" w:w="4300"/>
+            <w:tcBorders>
+              <w:top w:val="single" w:color="BBBBBB" w:sz="4"/>
+              <w:left w:val="single" w:color="BBBBBB" w:sz="4"/>
+              <w:bottom w:val="single" w:color="BBBBBB" w:sz="4"/>
+              <w:right w:val="single" w:color="BBBBBB" w:sz="4"/>
+            </w:tcBorders>
+            <w:tcMar>
+              <w:top w:type="dxa" w:w="50"/>
+              <w:left w:type="dxa" w:w="90"/>
+              <w:bottom w:type="dxa" w:w="50"/>
+              <w:right w:type="dxa" w:w="90"/>
+            </w:tcMar>
+          </w:tcPr>
+          <w:p>
+            <w:r>
+              <w:rPr>
+                <w:sz w:val="18"/>
+                <w:szCs w:val="18"/>
+              </w:rPr>
+              <w:t xml:space="preserve">La nota esperada (0 a 10) y la categoría del próximo examen: Promoción, Aprobado Regular, Recuperatorio o Desaprobado.</w:t>
+            </w:r>
+          </w:p>
+        </w:tc>
+        <w:tc>
+          <w:tcPr>
+            <w:tcW w:type="dxa" w:w="2726"/>
+            <w:tcBorders>
+              <w:top w:val="single" w:color="BBBBBB" w:sz="4"/>
+              <w:left w:val="single" w:color="BBBBBB" w:sz="4"/>
+              <w:bottom w:val="single" w:color="BBBBBB" w:sz="4"/>
+              <w:right w:val="single" w:color="BBBBBB" w:sz="4"/>
+            </w:tcBorders>
+            <w:tcMar>
+              <w:top w:type="dxa" w:w="50"/>
+              <w:left w:type="dxa" w:w="90"/>
+              <w:bottom w:type="dxa" w:w="50"/>
+              <w:right w:type="dxa" w:w="90"/>
+            </w:tcMar>
+          </w:tcPr>
+          <w:p>
+            <w:r>
+              <w:rPr>
+                <w:sz w:val="18"/>
+                <w:szCs w:val="18"/>
+              </w:rPr>
+              <w:t xml:space="preserve">Alertas de deserción, recomendaciones o intervenciones pedagógicas (corrección de cátedra).</w:t>
+            </w:r>
+          </w:p>
+        </w:tc>
+      </w:tr>
+      <w:tr>
+        <w:tc>
+          <w:tcPr>
+            <w:tcW w:type="dxa" w:w="2000"/>
+            <w:tcBorders>
+              <w:top w:val="single" w:color="BBBBBB" w:sz="4"/>
+              <w:left w:val="single" w:color="BBBBBB" w:sz="4"/>
+              <w:bottom w:val="single" w:color="BBBBBB" w:sz="4"/>
+              <w:right w:val="single" w:color="BBBBBB" w:sz="4"/>
+            </w:tcBorders>
+            <w:tcMar>
+              <w:top w:type="dxa" w:w="50"/>
+              <w:left w:type="dxa" w:w="90"/>
+              <w:bottom w:type="dxa" w:w="50"/>
+              <w:right w:type="dxa" w:w="90"/>
+            </w:tcMar>
+          </w:tcPr>
+          <w:p>
+            <w:r>
+              <w:rPr>
+                <w:b/>
+                <w:bCs/>
+                <w:sz w:val="18"/>
+                <w:szCs w:val="18"/>
+              </w:rPr>
+              <w:t xml:space="preserve">Con qué datos</w:t>
+            </w:r>
+          </w:p>
+        </w:tc>
+        <w:tc>
+          <w:tcPr>
+            <w:tcW w:type="dxa" w:w="4300"/>
+            <w:tcBorders>
+              <w:top w:val="single" w:color="BBBBBB" w:sz="4"/>
+              <w:left w:val="single" w:color="BBBBBB" w:sz="4"/>
+              <w:bottom w:val="single" w:color="BBBBBB" w:sz="4"/>
+              <w:right w:val="single" w:color="BBBBBB" w:sz="4"/>
+            </w:tcBorders>
+            <w:tcMar>
+              <w:top w:type="dxa" w:w="50"/>
+              <w:left w:type="dxa" w:w="90"/>
+              <w:bottom w:type="dxa" w:w="50"/>
+              <w:right w:type="dxa" w:w="90"/>
+            </w:tcMar>
+          </w:tcPr>
+          <w:p>
+            <w:r>
+              <w:rPr>
+                <w:sz w:val="18"/>
+                <w:szCs w:val="18"/>
+              </w:rPr>
+              <w:t xml:space="preserve">5 variables por alumno: horas de estudio, asistencia, uso de internet, tareas (a base 100) y nota previa. La nota real nunca entra a la red.</w:t>
+            </w:r>
+          </w:p>
+        </w:tc>
+        <w:tc>
+          <w:tcPr>
+            <w:tcW w:type="dxa" w:w="2726"/>
+            <w:tcBorders>
+              <w:top w:val="single" w:color="BBBBBB" w:sz="4"/>
+              <w:left w:val="single" w:color="BBBBBB" w:sz="4"/>
+              <w:bottom w:val="single" w:color="BBBBBB" w:sz="4"/>
+              <w:right w:val="single" w:color="BBBBBB" w:sz="4"/>
+            </w:tcBorders>
+            <w:tcMar>
+              <w:top w:type="dxa" w:w="50"/>
+              <w:left w:type="dxa" w:w="90"/>
+              <w:bottom w:type="dxa" w:w="50"/>
+              <w:right w:type="dxa" w:w="90"/>
+            </w:tcMar>
+          </w:tcPr>
+          <w:p>
+            <w:r>
+              <w:rPr>
+                <w:sz w:val="18"/>
+                <w:szCs w:val="18"/>
+              </w:rPr>
+              <w:t xml:space="preserve">En el dataset 1: sueño (solo chequeo de 24 hs), placement_status y tareas separadas por tipo (el dataset no las trae).</w:t>
+            </w:r>
+          </w:p>
+        </w:tc>
+      </w:tr>
+      <w:tr>
+        <w:tc>
+          <w:tcPr>
+            <w:tcW w:type="dxa" w:w="2000"/>
+            <w:tcBorders>
+              <w:top w:val="single" w:color="BBBBBB" w:sz="4"/>
+              <w:left w:val="single" w:color="BBBBBB" w:sz="4"/>
+              <w:bottom w:val="single" w:color="BBBBBB" w:sz="4"/>
+              <w:right w:val="single" w:color="BBBBBB" w:sz="4"/>
+            </w:tcBorders>
+            <w:tcMar>
+              <w:top w:type="dxa" w:w="50"/>
+              <w:left w:type="dxa" w:w="90"/>
+              <w:bottom w:type="dxa" w:w="50"/>
+              <w:right w:type="dxa" w:w="90"/>
+            </w:tcMar>
+          </w:tcPr>
+          <w:p>
+            <w:r>
+              <w:rPr>
+                <w:b/>
+                <w:bCs/>
+                <w:sz w:val="18"/>
+                <w:szCs w:val="18"/>
+              </w:rPr>
+              <w:t xml:space="preserve">Datasets</w:t>
+            </w:r>
+          </w:p>
+        </w:tc>
+        <w:tc>
+          <w:tcPr>
+            <w:tcW w:type="dxa" w:w="4300"/>
+            <w:tcBorders>
+              <w:top w:val="single" w:color="BBBBBB" w:sz="4"/>
+              <w:left w:val="single" w:color="BBBBBB" w:sz="4"/>
+              <w:bottom w:val="single" w:color="BBBBBB" w:sz="4"/>
+              <w:right w:val="single" w:color="BBBBBB" w:sz="4"/>
+            </w:tcBorders>
+            <w:tcMar>
+              <w:top w:type="dxa" w:w="50"/>
+              <w:left w:type="dxa" w:w="90"/>
+              <w:bottom w:type="dxa" w:w="50"/>
+              <w:right w:type="dxa" w:w="90"/>
+            </w:tcMar>
+          </w:tcPr>
+          <w:p>
+            <w:r>
+              <w:rPr>
+                <w:sz w:val="18"/>
+                <w:szCs w:val="18"/>
+              </w:rPr>
+              <w:t xml:space="preserve">Dataset 1 simulado de 10.000 alumnos (D-10) y Student Performance Factors de 6.607 alumnos (D-18), con el mismo pipeline.</w:t>
+            </w:r>
+          </w:p>
+        </w:tc>
+        <w:tc>
+          <w:tcPr>
+            <w:tcW w:type="dxa" w:w="2726"/>
+            <w:tcBorders>
+              <w:top w:val="single" w:color="BBBBBB" w:sz="4"/>
+              <w:left w:val="single" w:color="BBBBBB" w:sz="4"/>
+              <w:bottom w:val="single" w:color="BBBBBB" w:sz="4"/>
+              <w:right w:val="single" w:color="BBBBBB" w:sz="4"/>
+            </w:tcBorders>
+            <w:tcMar>
+              <w:top w:type="dxa" w:w="50"/>
+              <w:left w:type="dxa" w:w="90"/>
+              <w:bottom w:type="dxa" w:w="50"/>
+              <w:right w:type="dxa" w:w="90"/>
+            </w:tcMar>
+          </w:tcPr>
+          <w:p>
+            <w:r>
+              <w:rPr>
+                <w:sz w:val="18"/>
+                <w:szCs w:val="18"/>
+              </w:rPr>
+              <w:t xml:space="preserve">Alumnos reales de la facultad: el sistema no se validó con ellos.</w:t>
+            </w:r>
+          </w:p>
+        </w:tc>
+      </w:tr>
+      <w:tr>
+        <w:tc>
+          <w:tcPr>
+            <w:tcW w:type="dxa" w:w="2000"/>
+            <w:tcBorders>
+              <w:top w:val="single" w:color="BBBBBB" w:sz="4"/>
+              <w:left w:val="single" w:color="BBBBBB" w:sz="4"/>
+              <w:bottom w:val="single" w:color="BBBBBB" w:sz="4"/>
+              <w:right w:val="single" w:color="BBBBBB" w:sz="4"/>
+            </w:tcBorders>
+            <w:tcMar>
+              <w:top w:type="dxa" w:w="50"/>
+              <w:left w:type="dxa" w:w="90"/>
+              <w:bottom w:type="dxa" w:w="50"/>
+              <w:right w:type="dxa" w:w="90"/>
+            </w:tcMar>
+          </w:tcPr>
+          <w:p>
+            <w:r>
+              <w:rPr>
+                <w:b/>
+                <w:bCs/>
+                <w:sz w:val="18"/>
+                <w:szCs w:val="18"/>
+              </w:rPr>
+              <w:t xml:space="preserve">Cómo se usa</w:t>
+            </w:r>
+          </w:p>
+        </w:tc>
+        <w:tc>
+          <w:tcPr>
+            <w:tcW w:type="dxa" w:w="4300"/>
+            <w:tcBorders>
+              <w:top w:val="single" w:color="BBBBBB" w:sz="4"/>
+              <w:left w:val="single" w:color="BBBBBB" w:sz="4"/>
+              <w:bottom w:val="single" w:color="BBBBBB" w:sz="4"/>
+              <w:right w:val="single" w:color="BBBBBB" w:sz="4"/>
+            </w:tcBorders>
+            <w:tcMar>
+              <w:top w:type="dxa" w:w="50"/>
+              <w:left w:type="dxa" w:w="90"/>
+              <w:bottom w:type="dxa" w:w="50"/>
+              <w:right w:type="dxa" w:w="90"/>
+            </w:tcMar>
+          </w:tcPr>
+          <w:p>
+            <w:r>
+              <w:rPr>
+                <w:sz w:val="18"/>
+                <w:szCs w:val="18"/>
+              </w:rPr>
+              <w:t xml:space="preserve">CLI CarGross.py (5 modos, man ante errores) y app Streamlit. Entrada y salida en CSV.</w:t>
+            </w:r>
+          </w:p>
+        </w:tc>
+        <w:tc>
+          <w:tcPr>
+            <w:tcW w:type="dxa" w:w="2726"/>
+            <w:tcBorders>
+              <w:top w:val="single" w:color="BBBBBB" w:sz="4"/>
+              <w:left w:val="single" w:color="BBBBBB" w:sz="4"/>
+              <w:bottom w:val="single" w:color="BBBBBB" w:sz="4"/>
+              <w:right w:val="single" w:color="BBBBBB" w:sz="4"/>
+            </w:tcBorders>
+            <w:tcMar>
+              <w:top w:type="dxa" w:w="50"/>
+              <w:left w:type="dxa" w:w="90"/>
+              <w:bottom w:type="dxa" w:w="50"/>
+              <w:right w:type="dxa" w:w="90"/>
+            </w:tcMar>
+          </w:tcPr>
+          <w:p>
+            <w:r>
+              <w:rPr>
+                <w:sz w:val="18"/>
+                <w:szCs w:val="18"/>
+              </w:rPr>
+              <w:t xml:space="preserve">Uso en producción, base de datos o reentrenamiento automático.</w:t>
+            </w:r>
+          </w:p>
+        </w:tc>
+      </w:tr>
+      <w:tr>
+        <w:tc>
+          <w:tcPr>
+            <w:tcW w:type="dxa" w:w="2000"/>
+            <w:tcBorders>
+              <w:top w:val="single" w:color="BBBBBB" w:sz="4"/>
+              <w:left w:val="single" w:color="BBBBBB" w:sz="4"/>
+              <w:bottom w:val="single" w:color="BBBBBB" w:sz="4"/>
+              <w:right w:val="single" w:color="BBBBBB" w:sz="4"/>
+            </w:tcBorders>
+            <w:tcMar>
+              <w:top w:type="dxa" w:w="50"/>
+              <w:left w:type="dxa" w:w="90"/>
+              <w:bottom w:type="dxa" w:w="50"/>
+              <w:right w:type="dxa" w:w="90"/>
+            </w:tcMar>
+          </w:tcPr>
+          <w:p>
+            <w:r>
+              <w:rPr>
+                <w:b/>
+                <w:bCs/>
+                <w:sz w:val="18"/>
+                <w:szCs w:val="18"/>
+              </w:rPr>
+              <w:t xml:space="preserve">Cómo aprende</w:t>
+            </w:r>
+          </w:p>
+        </w:tc>
+        <w:tc>
+          <w:tcPr>
+            <w:tcW w:type="dxa" w:w="4300"/>
+            <w:tcBorders>
+              <w:top w:val="single" w:color="BBBBBB" w:sz="4"/>
+              <w:left w:val="single" w:color="BBBBBB" w:sz="4"/>
+              <w:bottom w:val="single" w:color="BBBBBB" w:sz="4"/>
+              <w:right w:val="single" w:color="BBBBBB" w:sz="4"/>
+            </w:tcBorders>
+            <w:tcMar>
+              <w:top w:type="dxa" w:w="50"/>
+              <w:left w:type="dxa" w:w="90"/>
+              <w:bottom w:type="dxa" w:w="50"/>
+              <w:right w:type="dxa" w:w="90"/>
+            </w:tcMar>
+          </w:tcPr>
+          <w:p>
+            <w:r>
+              <w:rPr>
+                <w:sz w:val="18"/>
+                <w:szCs w:val="18"/>
+              </w:rPr>
+              <w:t xml:space="preserve">Sin supervisión: EM arma los perfiles y ART 1 los aprende. La nota solo se usa después, para dar a cada nodo su nota media.</w:t>
+            </w:r>
+          </w:p>
+        </w:tc>
+        <w:tc>
+          <w:tcPr>
+            <w:tcW w:type="dxa" w:w="2726"/>
+            <w:tcBorders>
+              <w:top w:val="single" w:color="BBBBBB" w:sz="4"/>
+              <w:left w:val="single" w:color="BBBBBB" w:sz="4"/>
+              <w:bottom w:val="single" w:color="BBBBBB" w:sz="4"/>
+              <w:right w:val="single" w:color="BBBBBB" w:sz="4"/>
+            </w:tcBorders>
+            <w:tcMar>
+              <w:top w:type="dxa" w:w="50"/>
+              <w:left w:type="dxa" w:w="90"/>
+              <w:bottom w:type="dxa" w:w="50"/>
+              <w:right w:type="dxa" w:w="90"/>
+            </w:tcMar>
+          </w:tcPr>
+          <w:p>
+            <w:r>
+              <w:rPr>
+                <w:sz w:val="18"/>
+                <w:szCs w:val="18"/>
+              </w:rPr>
+              <w:t xml:space="preserve">Explicar causas: dice qué nota esperar, no por qué ni qué cambiar.</w:t>
+            </w:r>
+          </w:p>
+        </w:tc>
+      </w:tr>
+    </w:tbl>
+    <w:p>
+      <w:pPr>
+        <w:pStyle w:val="Heading2"/>
+      </w:pPr>
+      <w:r>
+        <w:t xml:space="preserve">10.2 Limitaciones</w:t>
+      </w:r>
+    </w:p>
+    <w:p>
+      <w:pPr>
+        <w:spacing w:after="120"/>
+      </w:pPr>
+      <w:r>
+        <w:rPr>
+          <w:sz w:val="20"/>
+          <w:szCs w:val="20"/>
+        </w:rPr>
+        <w:t xml:space="preserve">Son los puntos débiles medidos. Ninguno es un error del código: salen de los datos o de la arquitectura EM + ART 1 con código binario que pidió la cátedra.</w:t>
+      </w:r>
+    </w:p>
+    <w:tbl>
+      <w:tblPr>
+        <w:tblW w:type="dxa" w:w="9026"/>
+        <w:tblBorders>
+          <w:top w:val="single" w:color="auto" w:sz="4"/>
+          <w:left w:val="single" w:color="auto" w:sz="4"/>
+          <w:bottom w:val="single" w:color="auto" w:sz="4"/>
+          <w:right w:val="single" w:color="auto" w:sz="4"/>
+          <w:insideH w:val="single" w:color="auto" w:sz="4"/>
+          <w:insideV w:val="single" w:color="auto" w:sz="4"/>
+        </w:tblBorders>
+      </w:tblPr>
+      <w:tblGrid>
+        <w:gridCol w:w="2000"/>
+        <w:gridCol w:w="4300"/>
+        <w:gridCol w:w="2726"/>
+      </w:tblGrid>
+      <w:tr>
+        <w:trPr>
+          <w:tblHeader/>
+        </w:trPr>
+        <w:tc>
+          <w:tcPr>
+            <w:tcW w:type="dxa" w:w="2000"/>
+            <w:tcBorders>
+              <w:top w:val="single" w:color="BBBBBB" w:sz="4"/>
+              <w:left w:val="single" w:color="BBBBBB" w:sz="4"/>
+              <w:bottom w:val="single" w:color="BBBBBB" w:sz="4"/>
+              <w:right w:val="single" w:color="BBBBBB" w:sz="4"/>
+            </w:tcBorders>
+            <w:shd w:fill="1F3864" w:color="auto" w:val="clear"/>
+            <w:tcMar>
+              <w:top w:type="dxa" w:w="50"/>
+              <w:left w:type="dxa" w:w="90"/>
+              <w:bottom w:type="dxa" w:w="50"/>
+              <w:right w:type="dxa" w:w="90"/>
+            </w:tcMar>
+          </w:tcPr>
+          <w:p>
+            <w:r>
+              <w:rPr>
+                <w:b/>
+                <w:bCs/>
+                <w:color w:val="FFFFFF"/>
+                <w:sz w:val="18"/>
+                <w:szCs w:val="18"/>
+              </w:rPr>
+              <w:t xml:space="preserve">Limitación</w:t>
+            </w:r>
+          </w:p>
+        </w:tc>
+        <w:tc>
+          <w:tcPr>
+            <w:tcW w:type="dxa" w:w="4300"/>
+            <w:tcBorders>
+              <w:top w:val="single" w:color="BBBBBB" w:sz="4"/>
+              <w:left w:val="single" w:color="BBBBBB" w:sz="4"/>
+              <w:bottom w:val="single" w:color="BBBBBB" w:sz="4"/>
+              <w:right w:val="single" w:color="BBBBBB" w:sz="4"/>
+            </w:tcBorders>
+            <w:shd w:fill="1F3864" w:color="auto" w:val="clear"/>
+            <w:tcMar>
+              <w:top w:type="dxa" w:w="50"/>
+              <w:left w:type="dxa" w:w="90"/>
+              <w:bottom w:type="dxa" w:w="50"/>
+              <w:right w:type="dxa" w:w="90"/>
+            </w:tcMar>
+          </w:tcPr>
+          <w:p>
+            <w:r>
+              <w:rPr>
+                <w:b/>
+                <w:bCs/>
+                <w:color w:val="FFFFFF"/>
+                <w:sz w:val="18"/>
+                <w:szCs w:val="18"/>
+              </w:rPr>
+              <w:t xml:space="preserve">Qué pasa (dato medido)</w:t>
+            </w:r>
+          </w:p>
+        </w:tc>
+        <w:tc>
+          <w:tcPr>
+            <w:tcW w:type="dxa" w:w="2726"/>
+            <w:tcBorders>
+              <w:top w:val="single" w:color="BBBBBB" w:sz="4"/>
+              <w:left w:val="single" w:color="BBBBBB" w:sz="4"/>
+              <w:bottom w:val="single" w:color="BBBBBB" w:sz="4"/>
+              <w:right w:val="single" w:color="BBBBBB" w:sz="4"/>
+            </w:tcBorders>
+            <w:shd w:fill="1F3864" w:color="auto" w:val="clear"/>
+            <w:tcMar>
+              <w:top w:type="dxa" w:w="50"/>
+              <w:left w:type="dxa" w:w="90"/>
+              <w:bottom w:type="dxa" w:w="50"/>
+              <w:right w:type="dxa" w:w="90"/>
+            </w:tcMar>
+          </w:tcPr>
+          <w:p>
+            <w:r>
+              <w:rPr>
+                <w:b/>
+                <w:bCs/>
+                <w:color w:val="FFFFFF"/>
+                <w:sz w:val="18"/>
+                <w:szCs w:val="18"/>
+              </w:rPr>
+              <w:t xml:space="preserve">Qué significa</w:t>
+            </w:r>
+          </w:p>
+        </w:tc>
+      </w:tr>
+      <w:tr>
+        <w:tc>
+          <w:tcPr>
+            <w:tcW w:type="dxa" w:w="2000"/>
+            <w:tcBorders>
+              <w:top w:val="single" w:color="BBBBBB" w:sz="4"/>
+              <w:left w:val="single" w:color="BBBBBB" w:sz="4"/>
+              <w:bottom w:val="single" w:color="BBBBBB" w:sz="4"/>
+              <w:right w:val="single" w:color="BBBBBB" w:sz="4"/>
+            </w:tcBorders>
+            <w:tcMar>
+              <w:top w:type="dxa" w:w="50"/>
+              <w:left w:type="dxa" w:w="90"/>
+              <w:bottom w:type="dxa" w:w="50"/>
+              <w:right w:type="dxa" w:w="90"/>
+            </w:tcMar>
+          </w:tcPr>
+          <w:p>
+            <w:r>
+              <w:rPr>
+                <w:b/>
+                <w:bCs/>
+                <w:sz w:val="18"/>
+                <w:szCs w:val="18"/>
+              </w:rPr>
+              <w:t xml:space="preserve">Datos simulados</w:t>
+            </w:r>
+          </w:p>
+        </w:tc>
+        <w:tc>
+          <w:tcPr>
+            <w:tcW w:type="dxa" w:w="4300"/>
+            <w:tcBorders>
+              <w:top w:val="single" w:color="BBBBBB" w:sz="4"/>
+              <w:left w:val="single" w:color="BBBBBB" w:sz="4"/>
+              <w:bottom w:val="single" w:color="BBBBBB" w:sz="4"/>
+              <w:right w:val="single" w:color="BBBBBB" w:sz="4"/>
+            </w:tcBorders>
+            <w:tcMar>
+              <w:top w:type="dxa" w:w="50"/>
+              <w:left w:type="dxa" w:w="90"/>
+              <w:bottom w:type="dxa" w:w="50"/>
+              <w:right w:type="dxa" w:w="90"/>
+            </w:tcMar>
+          </w:tcPr>
+          <w:p>
+            <w:r>
+              <w:rPr>
+                <w:sz w:val="18"/>
+                <w:szCs w:val="18"/>
+              </w:rPr>
+              <w:t xml:space="preserve">El dataset 1 es simulado (D-10, aprobado por la docente).</w:t>
+            </w:r>
+          </w:p>
+        </w:tc>
+        <w:tc>
+          <w:tcPr>
+            <w:tcW w:type="dxa" w:w="2726"/>
+            <w:tcBorders>
+              <w:top w:val="single" w:color="BBBBBB" w:sz="4"/>
+              <w:left w:val="single" w:color="BBBBBB" w:sz="4"/>
+              <w:bottom w:val="single" w:color="BBBBBB" w:sz="4"/>
+              <w:right w:val="single" w:color="BBBBBB" w:sz="4"/>
+            </w:tcBorders>
+            <w:tcMar>
+              <w:top w:type="dxa" w:w="50"/>
+              <w:left w:type="dxa" w:w="90"/>
+              <w:bottom w:type="dxa" w:w="50"/>
+              <w:right w:type="dxa" w:w="90"/>
+            </w:tcMar>
+          </w:tcPr>
+          <w:p>
+            <w:r>
+              <w:rPr>
+                <w:sz w:val="18"/>
+                <w:szCs w:val="18"/>
+              </w:rPr>
+              <w:t xml:space="preserve">Muestra que la arquitectura funciona, no que prediga a alumnos reales.</w:t>
+            </w:r>
+          </w:p>
+        </w:tc>
+      </w:tr>
+      <w:tr>
+        <w:tc>
+          <w:tcPr>
+            <w:tcW w:type="dxa" w:w="2000"/>
+            <w:tcBorders>
+              <w:top w:val="single" w:color="BBBBBB" w:sz="4"/>
+              <w:left w:val="single" w:color="BBBBBB" w:sz="4"/>
+              <w:bottom w:val="single" w:color="BBBBBB" w:sz="4"/>
+              <w:right w:val="single" w:color="BBBBBB" w:sz="4"/>
+            </w:tcBorders>
+            <w:tcMar>
+              <w:top w:type="dxa" w:w="50"/>
+              <w:left w:type="dxa" w:w="90"/>
+              <w:bottom w:type="dxa" w:w="50"/>
+              <w:right w:type="dxa" w:w="90"/>
+            </w:tcMar>
+          </w:tcPr>
+          <w:p>
+            <w:r>
+              <w:rPr>
+                <w:b/>
+                <w:bCs/>
+                <w:sz w:val="18"/>
+                <w:szCs w:val="18"/>
+              </w:rPr>
+              <w:t xml:space="preserve">Grupos del EM superpuestos</w:t>
+            </w:r>
+          </w:p>
+        </w:tc>
+        <w:tc>
+          <w:tcPr>
+            <w:tcW w:type="dxa" w:w="4300"/>
+            <w:tcBorders>
+              <w:top w:val="single" w:color="BBBBBB" w:sz="4"/>
+              <w:left w:val="single" w:color="BBBBBB" w:sz="4"/>
+              <w:bottom w:val="single" w:color="BBBBBB" w:sz="4"/>
+              <w:right w:val="single" w:color="BBBBBB" w:sz="4"/>
+            </w:tcBorders>
+            <w:tcMar>
+              <w:top w:type="dxa" w:w="50"/>
+              <w:left w:type="dxa" w:w="90"/>
+              <w:bottom w:type="dxa" w:w="50"/>
+              <w:right w:type="dxa" w:w="90"/>
+            </w:tcMar>
+          </w:tcPr>
+          <w:p>
+            <w:r>
+              <w:rPr>
+                <w:sz w:val="18"/>
+                <w:szCs w:val="18"/>
+              </w:rPr>
+              <w:t xml:space="preserve">Silhouette 0,19 (meta ≥ 0,40) y entropía de responsabilidades 0,47.</w:t>
+            </w:r>
+          </w:p>
+        </w:tc>
+        <w:tc>
+          <w:tcPr>
+            <w:tcW w:type="dxa" w:w="2726"/>
+            <w:tcBorders>
+              <w:top w:val="single" w:color="BBBBBB" w:sz="4"/>
+              <w:left w:val="single" w:color="BBBBBB" w:sz="4"/>
+              <w:bottom w:val="single" w:color="BBBBBB" w:sz="4"/>
+              <w:right w:val="single" w:color="BBBBBB" w:sz="4"/>
+            </w:tcBorders>
+            <w:tcMar>
+              <w:top w:type="dxa" w:w="50"/>
+              <w:left w:type="dxa" w:w="90"/>
+              <w:bottom w:type="dxa" w:w="50"/>
+              <w:right w:type="dxa" w:w="90"/>
+            </w:tcMar>
+          </w:tcPr>
+          <w:p>
+            <w:r>
+              <w:rPr>
+                <w:sz w:val="18"/>
+                <w:szCs w:val="18"/>
+              </w:rPr>
+              <w:t xml:space="preserve">Los perfiles se pisan: muchos alumnos quedan entre dos grupos.</w:t>
+            </w:r>
+          </w:p>
+        </w:tc>
+      </w:tr>
+      <w:tr>
+        <w:tc>
+          <w:tcPr>
+            <w:tcW w:type="dxa" w:w="2000"/>
+            <w:tcBorders>
+              <w:top w:val="single" w:color="BBBBBB" w:sz="4"/>
+              <w:left w:val="single" w:color="BBBBBB" w:sz="4"/>
+              <w:bottom w:val="single" w:color="BBBBBB" w:sz="4"/>
+              <w:right w:val="single" w:color="BBBBBB" w:sz="4"/>
+            </w:tcBorders>
+            <w:tcMar>
+              <w:top w:type="dxa" w:w="50"/>
+              <w:left w:type="dxa" w:w="90"/>
+              <w:bottom w:type="dxa" w:w="50"/>
+              <w:right w:type="dxa" w:w="90"/>
+            </w:tcMar>
+          </w:tcPr>
+          <w:p>
+            <w:r>
+              <w:rPr>
+                <w:b/>
+                <w:bCs/>
+                <w:sz w:val="18"/>
+                <w:szCs w:val="18"/>
+              </w:rPr>
+              <w:t xml:space="preserve">Categoría poco precisa</w:t>
+            </w:r>
+          </w:p>
+        </w:tc>
+        <w:tc>
+          <w:tcPr>
+            <w:tcW w:type="dxa" w:w="4300"/>
+            <w:tcBorders>
+              <w:top w:val="single" w:color="BBBBBB" w:sz="4"/>
+              <w:left w:val="single" w:color="BBBBBB" w:sz="4"/>
+              <w:bottom w:val="single" w:color="BBBBBB" w:sz="4"/>
+              <w:right w:val="single" w:color="BBBBBB" w:sz="4"/>
+            </w:tcBorders>
+            <w:tcMar>
+              <w:top w:type="dxa" w:w="50"/>
+              <w:left w:type="dxa" w:w="90"/>
+              <w:bottom w:type="dxa" w:w="50"/>
+              <w:right w:type="dxa" w:w="90"/>
+            </w:tcMar>
+          </w:tcPr>
+          <w:p>
+            <w:r>
+              <w:rPr>
+                <w:sz w:val="18"/>
+                <w:szCs w:val="18"/>
+              </w:rPr>
+              <w:t xml:space="preserve">Acierta el 57,2%, pero el 98% queda en su categoría o en la de al lado.</w:t>
+            </w:r>
+          </w:p>
+        </w:tc>
+        <w:tc>
+          <w:tcPr>
+            <w:tcW w:type="dxa" w:w="2726"/>
+            <w:tcBorders>
+              <w:top w:val="single" w:color="BBBBBB" w:sz="4"/>
+              <w:left w:val="single" w:color="BBBBBB" w:sz="4"/>
+              <w:bottom w:val="single" w:color="BBBBBB" w:sz="4"/>
+              <w:right w:val="single" w:color="BBBBBB" w:sz="4"/>
+            </w:tcBorders>
+            <w:tcMar>
+              <w:top w:type="dxa" w:w="50"/>
+              <w:left w:type="dxa" w:w="90"/>
+              <w:bottom w:type="dxa" w:w="50"/>
+              <w:right w:type="dxa" w:w="90"/>
+            </w:tcMar>
+          </w:tcPr>
+          <w:p>
+            <w:r>
+              <w:rPr>
+                <w:sz w:val="18"/>
+                <w:szCs w:val="18"/>
+              </w:rPr>
+              <w:t xml:space="preserve">Muchos alumnos están cerca de un límite (4, 6 u 8) y un error chico en la nota cambia la categoría.</w:t>
+            </w:r>
+          </w:p>
+        </w:tc>
+      </w:tr>
+      <w:tr>
+        <w:tc>
+          <w:tcPr>
+            <w:tcW w:type="dxa" w:w="2000"/>
+            <w:tcBorders>
+              <w:top w:val="single" w:color="BBBBBB" w:sz="4"/>
+              <w:left w:val="single" w:color="BBBBBB" w:sz="4"/>
+              <w:bottom w:val="single" w:color="BBBBBB" w:sz="4"/>
+              <w:right w:val="single" w:color="BBBBBB" w:sz="4"/>
+            </w:tcBorders>
+            <w:tcMar>
+              <w:top w:type="dxa" w:w="50"/>
+              <w:left w:type="dxa" w:w="90"/>
+              <w:bottom w:type="dxa" w:w="50"/>
+              <w:right w:type="dxa" w:w="90"/>
+            </w:tcMar>
+          </w:tcPr>
+          <w:p>
+            <w:r>
+              <w:rPr>
+                <w:b/>
+                <w:bCs/>
+                <w:sz w:val="18"/>
+                <w:szCs w:val="18"/>
+              </w:rPr>
+              <w:t xml:space="preserve">Extremos suavizados</w:t>
+            </w:r>
+          </w:p>
+        </w:tc>
+        <w:tc>
+          <w:tcPr>
+            <w:tcW w:type="dxa" w:w="4300"/>
+            <w:tcBorders>
+              <w:top w:val="single" w:color="BBBBBB" w:sz="4"/>
+              <w:left w:val="single" w:color="BBBBBB" w:sz="4"/>
+              <w:bottom w:val="single" w:color="BBBBBB" w:sz="4"/>
+              <w:right w:val="single" w:color="BBBBBB" w:sz="4"/>
+            </w:tcBorders>
+            <w:tcMar>
+              <w:top w:type="dxa" w:w="50"/>
+              <w:left w:type="dxa" w:w="90"/>
+              <w:bottom w:type="dxa" w:w="50"/>
+              <w:right w:type="dxa" w:w="90"/>
+            </w:tcMar>
+          </w:tcPr>
+          <w:p>
+            <w:r>
+              <w:rPr>
+                <w:sz w:val="18"/>
+                <w:szCs w:val="18"/>
+              </w:rPr>
+              <w:t xml:space="preserve">Notas esperadas de 2,1 a 9,1 (las reales van de 0 a 10). Detecta 87 de 291 Promoción (30%) y 31 de 161 Desaprobado (19%).</w:t>
+            </w:r>
+          </w:p>
+        </w:tc>
+        <w:tc>
+          <w:tcPr>
+            <w:tcW w:type="dxa" w:w="2726"/>
+            <w:tcBorders>
+              <w:top w:val="single" w:color="BBBBBB" w:sz="4"/>
+              <w:left w:val="single" w:color="BBBBBB" w:sz="4"/>
+              <w:bottom w:val="single" w:color="BBBBBB" w:sz="4"/>
+              <w:right w:val="single" w:color="BBBBBB" w:sz="4"/>
+            </w:tcBorders>
+            <w:tcMar>
+              <w:top w:type="dxa" w:w="50"/>
+              <w:left w:type="dxa" w:w="90"/>
+              <w:bottom w:type="dxa" w:w="50"/>
+              <w:right w:type="dxa" w:w="90"/>
+            </w:tcMar>
+          </w:tcPr>
+          <w:p>
+            <w:r>
+              <w:rPr>
+                <w:sz w:val="18"/>
+                <w:szCs w:val="18"/>
+              </w:rPr>
+              <w:t xml:space="preserve">Cada nodo da el promedio de sus alumnos: la mayoría de los que desaprueban sale como Recuperatorio.</w:t>
+            </w:r>
+          </w:p>
+        </w:tc>
+      </w:tr>
+      <w:tr>
+        <w:tc>
+          <w:tcPr>
+            <w:tcW w:type="dxa" w:w="2000"/>
+            <w:tcBorders>
+              <w:top w:val="single" w:color="BBBBBB" w:sz="4"/>
+              <w:left w:val="single" w:color="BBBBBB" w:sz="4"/>
+              <w:bottom w:val="single" w:color="BBBBBB" w:sz="4"/>
+              <w:right w:val="single" w:color="BBBBBB" w:sz="4"/>
+            </w:tcBorders>
+            <w:tcMar>
+              <w:top w:type="dxa" w:w="50"/>
+              <w:left w:type="dxa" w:w="90"/>
+              <w:bottom w:type="dxa" w:w="50"/>
+              <w:right w:type="dxa" w:w="90"/>
+            </w:tcMar>
+          </w:tcPr>
+          <w:p>
+            <w:r>
+              <w:rPr>
+                <w:b/>
+                <w:bCs/>
+                <w:sz w:val="18"/>
+                <w:szCs w:val="18"/>
+              </w:rPr>
+              <w:t xml:space="preserve">Nota no monótona</w:t>
+            </w:r>
+          </w:p>
+        </w:tc>
+        <w:tc>
+          <w:tcPr>
+            <w:tcW w:type="dxa" w:w="4300"/>
+            <w:tcBorders>
+              <w:top w:val="single" w:color="BBBBBB" w:sz="4"/>
+              <w:left w:val="single" w:color="BBBBBB" w:sz="4"/>
+              <w:bottom w:val="single" w:color="BBBBBB" w:sz="4"/>
+              <w:right w:val="single" w:color="BBBBBB" w:sz="4"/>
+            </w:tcBorders>
+            <w:tcMar>
+              <w:top w:type="dxa" w:w="50"/>
+              <w:left w:type="dxa" w:w="90"/>
+              <w:bottom w:type="dxa" w:w="50"/>
+              <w:right w:type="dxa" w:w="90"/>
+            </w:tcMar>
+          </w:tcPr>
+          <w:p>
+            <w:r>
+              <w:rPr>
+                <w:sz w:val="18"/>
+                <w:szCs w:val="18"/>
+              </w:rPr>
+              <w:t xml:space="preserve">En el 17,7% de los casos, mejorar un hábito baja la nota más de 0,3 puntos.</w:t>
+            </w:r>
+          </w:p>
+        </w:tc>
+        <w:tc>
+          <w:tcPr>
+            <w:tcW w:type="dxa" w:w="2726"/>
+            <w:tcBorders>
+              <w:top w:val="single" w:color="BBBBBB" w:sz="4"/>
+              <w:left w:val="single" w:color="BBBBBB" w:sz="4"/>
+              <w:bottom w:val="single" w:color="BBBBBB" w:sz="4"/>
+              <w:right w:val="single" w:color="BBBBBB" w:sz="4"/>
+            </w:tcBorders>
+            <w:tcMar>
+              <w:top w:type="dxa" w:w="50"/>
+              <w:left w:type="dxa" w:w="90"/>
+              <w:bottom w:type="dxa" w:w="50"/>
+              <w:right w:type="dxa" w:w="90"/>
+            </w:tcMar>
+          </w:tcPr>
+          <w:p>
+            <w:r>
+              <w:rPr>
+                <w:sz w:val="18"/>
+                <w:szCs w:val="18"/>
+              </w:rPr>
+              <w:t xml:space="preserve">ART 1 compara bits y el código posicional no es ordinal (0111 y 1000 no comparten bits). Se mantiene el modelo (D-17).</w:t>
+            </w:r>
+          </w:p>
+        </w:tc>
+      </w:tr>
+      <w:tr>
+        <w:tc>
+          <w:tcPr>
+            <w:tcW w:type="dxa" w:w="2000"/>
+            <w:tcBorders>
+              <w:top w:val="single" w:color="BBBBBB" w:sz="4"/>
+              <w:left w:val="single" w:color="BBBBBB" w:sz="4"/>
+              <w:bottom w:val="single" w:color="BBBBBB" w:sz="4"/>
+              <w:right w:val="single" w:color="BBBBBB" w:sz="4"/>
+            </w:tcBorders>
+            <w:tcMar>
+              <w:top w:type="dxa" w:w="50"/>
+              <w:left w:type="dxa" w:w="90"/>
+              <w:bottom w:type="dxa" w:w="50"/>
+              <w:right w:type="dxa" w:w="90"/>
+            </w:tcMar>
+          </w:tcPr>
+          <w:p>
+            <w:r>
+              <w:rPr>
+                <w:b/>
+                <w:bCs/>
+                <w:sz w:val="18"/>
+                <w:szCs w:val="18"/>
+              </w:rPr>
+              <w:t xml:space="preserve">Nodos chicos</w:t>
+            </w:r>
+          </w:p>
+        </w:tc>
+        <w:tc>
+          <w:tcPr>
+            <w:tcW w:type="dxa" w:w="4300"/>
+            <w:tcBorders>
+              <w:top w:val="single" w:color="BBBBBB" w:sz="4"/>
+              <w:left w:val="single" w:color="BBBBBB" w:sz="4"/>
+              <w:bottom w:val="single" w:color="BBBBBB" w:sz="4"/>
+              <w:right w:val="single" w:color="BBBBBB" w:sz="4"/>
+            </w:tcBorders>
+            <w:tcMar>
+              <w:top w:type="dxa" w:w="50"/>
+              <w:left w:type="dxa" w:w="90"/>
+              <w:bottom w:type="dxa" w:w="50"/>
+              <w:right w:type="dxa" w:w="90"/>
+            </w:tcMar>
+          </w:tcPr>
+          <w:p>
+            <w:r>
+              <w:rPr>
+                <w:sz w:val="18"/>
+                <w:szCs w:val="18"/>
+              </w:rPr>
+              <w:t xml:space="preserve">399 de los 847 nodos con alumnos tienen menos de 5, y 148 tienen uno solo.</w:t>
+            </w:r>
+          </w:p>
+        </w:tc>
+        <w:tc>
+          <w:tcPr>
+            <w:tcW w:type="dxa" w:w="2726"/>
+            <w:tcBorders>
+              <w:top w:val="single" w:color="BBBBBB" w:sz="4"/>
+              <w:left w:val="single" w:color="BBBBBB" w:sz="4"/>
+              <w:bottom w:val="single" w:color="BBBBBB" w:sz="4"/>
+              <w:right w:val="single" w:color="BBBBBB" w:sz="4"/>
+            </w:tcBorders>
+            <w:tcMar>
+              <w:top w:type="dxa" w:w="50"/>
+              <w:left w:type="dxa" w:w="90"/>
+              <w:bottom w:type="dxa" w:w="50"/>
+              <w:right w:type="dxa" w:w="90"/>
+            </w:tcMar>
+          </w:tcPr>
+          <w:p>
+            <w:r>
+              <w:rPr>
+                <w:sz w:val="18"/>
+                <w:szCs w:val="18"/>
+              </w:rPr>
+              <w:t xml:space="preserve">Su nota media es ruidosa: depende de muy pocos alumnos.</w:t>
+            </w:r>
+          </w:p>
+        </w:tc>
+      </w:tr>
+      <w:tr>
+        <w:tc>
+          <w:tcPr>
+            <w:tcW w:type="dxa" w:w="2000"/>
+            <w:tcBorders>
+              <w:top w:val="single" w:color="BBBBBB" w:sz="4"/>
+              <w:left w:val="single" w:color="BBBBBB" w:sz="4"/>
+              <w:bottom w:val="single" w:color="BBBBBB" w:sz="4"/>
+              <w:right w:val="single" w:color="BBBBBB" w:sz="4"/>
+            </w:tcBorders>
+            <w:tcMar>
+              <w:top w:type="dxa" w:w="50"/>
+              <w:left w:type="dxa" w:w="90"/>
+              <w:bottom w:type="dxa" w:w="50"/>
+              <w:right w:type="dxa" w:w="90"/>
+            </w:tcMar>
+          </w:tcPr>
+          <w:p>
+            <w:r>
+              <w:rPr>
+                <w:b/>
+                <w:bCs/>
+                <w:sz w:val="18"/>
+                <w:szCs w:val="18"/>
+              </w:rPr>
+              <w:t xml:space="preserve">Dataset 2 poco informativo</w:t>
+            </w:r>
+          </w:p>
+        </w:tc>
+        <w:tc>
+          <w:tcPr>
+            <w:tcW w:type="dxa" w:w="4300"/>
+            <w:tcBorders>
+              <w:top w:val="single" w:color="BBBBBB" w:sz="4"/>
+              <w:left w:val="single" w:color="BBBBBB" w:sz="4"/>
+              <w:bottom w:val="single" w:color="BBBBBB" w:sz="4"/>
+              <w:right w:val="single" w:color="BBBBBB" w:sz="4"/>
+            </w:tcBorders>
+            <w:tcMar>
+              <w:top w:type="dxa" w:w="50"/>
+              <w:left w:type="dxa" w:w="90"/>
+              <w:bottom w:type="dxa" w:w="50"/>
+              <w:right w:type="dxa" w:w="90"/>
+            </w:tcMar>
+          </w:tcPr>
+          <w:p>
+            <w:r>
+              <w:rPr>
+                <w:sz w:val="18"/>
+                <w:szCs w:val="18"/>
+              </w:rPr>
+              <w:t xml:space="preserve">El 98% de las notas es Aprobado Regular y la red pronostica todo Aprobado Regular. MAE 0,23 contra 0,29 de dar el promedio. BIC sin mínimo hasta K = 7.</w:t>
+            </w:r>
+          </w:p>
+        </w:tc>
+        <w:tc>
+          <w:tcPr>
+            <w:tcW w:type="dxa" w:w="2726"/>
+            <w:tcBorders>
+              <w:top w:val="single" w:color="BBBBBB" w:sz="4"/>
+              <w:left w:val="single" w:color="BBBBBB" w:sz="4"/>
+              <w:bottom w:val="single" w:color="BBBBBB" w:sz="4"/>
+              <w:right w:val="single" w:color="BBBBBB" w:sz="4"/>
+            </w:tcBorders>
+            <w:tcMar>
+              <w:top w:type="dxa" w:w="50"/>
+              <w:left w:type="dxa" w:w="90"/>
+              <w:bottom w:type="dxa" w:w="50"/>
+              <w:right w:type="dxa" w:w="90"/>
+            </w:tcMar>
+          </w:tcPr>
+          <w:p>
+            <w:r>
+              <w:rPr>
+                <w:sz w:val="18"/>
+                <w:szCs w:val="18"/>
+              </w:rPr>
+              <w:t xml:space="preserve">El 98% de acierto engaña. Sirve para mostrar que el pipeline anda con otros datos, no que prediga mejor.</w:t>
+            </w:r>
+          </w:p>
+        </w:tc>
+      </w:tr>
+      <w:tr>
+        <w:tc>
+          <w:tcPr>
+            <w:tcW w:type="dxa" w:w="2000"/>
+            <w:tcBorders>
+              <w:top w:val="single" w:color="BBBBBB" w:sz="4"/>
+              <w:left w:val="single" w:color="BBBBBB" w:sz="4"/>
+              <w:bottom w:val="single" w:color="BBBBBB" w:sz="4"/>
+              <w:right w:val="single" w:color="BBBBBB" w:sz="4"/>
+            </w:tcBorders>
+            <w:tcMar>
+              <w:top w:type="dxa" w:w="50"/>
+              <w:left w:type="dxa" w:w="90"/>
+              <w:bottom w:type="dxa" w:w="50"/>
+              <w:right w:type="dxa" w:w="90"/>
+            </w:tcMar>
+          </w:tcPr>
+          <w:p>
+            <w:r>
+              <w:rPr>
+                <w:b/>
+                <w:bCs/>
+                <w:sz w:val="18"/>
+                <w:szCs w:val="18"/>
+              </w:rPr>
+              <w:t xml:space="preserve">Tareas mezcladas</w:t>
+            </w:r>
+          </w:p>
+        </w:tc>
+        <w:tc>
+          <w:tcPr>
+            <w:tcW w:type="dxa" w:w="4300"/>
+            <w:tcBorders>
+              <w:top w:val="single" w:color="BBBBBB" w:sz="4"/>
+              <w:left w:val="single" w:color="BBBBBB" w:sz="4"/>
+              <w:bottom w:val="single" w:color="BBBBBB" w:sz="4"/>
+              <w:right w:val="single" w:color="BBBBBB" w:sz="4"/>
+            </w:tcBorders>
+            <w:tcMar>
+              <w:top w:type="dxa" w:w="50"/>
+              <w:left w:type="dxa" w:w="90"/>
+              <w:bottom w:type="dxa" w:w="50"/>
+              <w:right w:type="dxa" w:w="90"/>
+            </w:tcMar>
+          </w:tcPr>
+          <w:p>
+            <w:r>
+              <w:rPr>
+                <w:sz w:val="18"/>
+                <w:szCs w:val="18"/>
+              </w:rPr>
+              <w:t xml:space="preserve">Una sola variable de tareas (D-03).</w:t>
+            </w:r>
+          </w:p>
+        </w:tc>
+        <w:tc>
+          <w:tcPr>
+            <w:tcW w:type="dxa" w:w="2726"/>
+            <w:tcBorders>
+              <w:top w:val="single" w:color="BBBBBB" w:sz="4"/>
+              <w:left w:val="single" w:color="BBBBBB" w:sz="4"/>
+              <w:bottom w:val="single" w:color="BBBBBB" w:sz="4"/>
+              <w:right w:val="single" w:color="BBBBBB" w:sz="4"/>
+            </w:tcBorders>
+            <w:tcMar>
+              <w:top w:type="dxa" w:w="50"/>
+              <w:left w:type="dxa" w:w="90"/>
+              <w:bottom w:type="dxa" w:w="50"/>
+              <w:right w:type="dxa" w:w="90"/>
+            </w:tcMar>
+          </w:tcPr>
+          <w:p>
+            <w:r>
+              <w:rPr>
+                <w:sz w:val="18"/>
+                <w:szCs w:val="18"/>
+              </w:rPr>
+              <w:t xml:space="preserve">El docente pidió una por tipo, pero el dataset no las separa.</w:t>
+            </w:r>
+          </w:p>
+        </w:tc>
+      </w:tr>
+      <w:tr>
+        <w:tc>
+          <w:tcPr>
+            <w:tcW w:type="dxa" w:w="2000"/>
+            <w:tcBorders>
+              <w:top w:val="single" w:color="BBBBBB" w:sz="4"/>
+              <w:left w:val="single" w:color="BBBBBB" w:sz="4"/>
+              <w:bottom w:val="single" w:color="BBBBBB" w:sz="4"/>
+              <w:right w:val="single" w:color="BBBBBB" w:sz="4"/>
+            </w:tcBorders>
+            <w:tcMar>
+              <w:top w:type="dxa" w:w="50"/>
+              <w:left w:type="dxa" w:w="90"/>
+              <w:bottom w:type="dxa" w:w="50"/>
+              <w:right w:type="dxa" w:w="90"/>
+            </w:tcMar>
+          </w:tcPr>
+          <w:p>
+            <w:r>
+              <w:rPr>
+                <w:b/>
+                <w:bCs/>
+                <w:sz w:val="18"/>
+                <w:szCs w:val="18"/>
+              </w:rPr>
+              <w:t xml:space="preserve">Nota previa</w:t>
+            </w:r>
+          </w:p>
+        </w:tc>
+        <w:tc>
+          <w:tcPr>
+            <w:tcW w:type="dxa" w:w="4300"/>
+            <w:tcBorders>
+              <w:top w:val="single" w:color="BBBBBB" w:sz="4"/>
+              <w:left w:val="single" w:color="BBBBBB" w:sz="4"/>
+              <w:bottom w:val="single" w:color="BBBBBB" w:sz="4"/>
+              <w:right w:val="single" w:color="BBBBBB" w:sz="4"/>
+            </w:tcBorders>
+            <w:tcMar>
+              <w:top w:type="dxa" w:w="50"/>
+              <w:left w:type="dxa" w:w="90"/>
+              <w:bottom w:type="dxa" w:w="50"/>
+              <w:right w:type="dxa" w:w="90"/>
+            </w:tcMar>
+          </w:tcPr>
+          <w:p>
+            <w:r>
+              <w:rPr>
+                <w:sz w:val="18"/>
+                <w:szCs w:val="18"/>
+              </w:rPr>
+              <w:t xml:space="preserve">Falta verificar que venga de materias comparables.</w:t>
+            </w:r>
+          </w:p>
+        </w:tc>
+        <w:tc>
+          <w:tcPr>
+            <w:tcW w:type="dxa" w:w="2726"/>
+            <w:tcBorders>
+              <w:top w:val="single" w:color="BBBBBB" w:sz="4"/>
+              <w:left w:val="single" w:color="BBBBBB" w:sz="4"/>
+              <w:bottom w:val="single" w:color="BBBBBB" w:sz="4"/>
+              <w:right w:val="single" w:color="BBBBBB" w:sz="4"/>
+            </w:tcBorders>
+            <w:tcMar>
+              <w:top w:type="dxa" w:w="50"/>
+              <w:left w:type="dxa" w:w="90"/>
+              <w:bottom w:type="dxa" w:w="50"/>
+              <w:right w:type="dxa" w:w="90"/>
+            </w:tcMar>
+          </w:tcPr>
+          <w:p>
+            <w:r>
+              <w:rPr>
+                <w:sz w:val="18"/>
+                <w:szCs w:val="18"/>
+              </w:rPr>
+              <w:t xml:space="preserve">Si no lo es, puede sesgar la predicción.</w:t>
+            </w:r>
+          </w:p>
+        </w:tc>
+      </w:tr>
+    </w:tbl>
+    <w:p>
+      <w:pPr>
+        <w:spacing w:after="160" w:before="60"/>
+      </w:pPr>
+      <w:r>
+        <w:rPr>
+          <w:i/>
+          <w:iCs/>
+          <w:color w:val="555555"/>
+          <w:sz w:val="18"/>
+          <w:szCs w:val="18"/>
+        </w:rPr>
+        <w:t xml:space="preserve">Fuente: data/output/predicciones_student.csv, metricas_student.csv y metricas_factors.csv (python -m src.metrics y python -m src.metrics factors).</w:t>
+      </w:r>
+    </w:p>
+    <w:p>
+      <w:pPr>
+        <w:spacing w:after="120"/>
       </w:pPr>
       <w:r>
         <w:rPr>
           <w:b/>
           <w:bCs/>
-        </w:rPr>
-        <w:t xml:space="preserve">Tareas mezcladas:</w:t>
-      </w:r>
-      <w:r>
-        <w:t xml:space="preserve"> una sola variable junta tipos de tarea distintos, que el docente pidió separar. El dataset no lo permite.</w:t>
-      </w:r>
-    </w:p>
-    <w:p>
-      <w:pPr>
-        <w:pStyle w:val="ListParagraph"/>
-        <w:numPr>
-          <w:ilvl w:val="0"/>
-          <w:numId w:val="2"/>
-        </w:numPr>
-        <w:spacing w:after="60"/>
-      </w:pPr>
-      <w:r>
-        <w:rPr>
-          <w:b/>
-          <w:bCs/>
-        </w:rPr>
-        <w:t xml:space="preserve">Datos simulados:</w:t>
-      </w:r>
-      <w:r>
-        <w:t xml:space="preserve"> los resultados muestran que la arquitectura funciona, no que prediga a alumnos reales.</w:t>
-      </w:r>
-    </w:p>
-    <w:p>
-      <w:pPr>
-        <w:pStyle w:val="ListParagraph"/>
-        <w:numPr>
-          <w:ilvl w:val="0"/>
-          <w:numId w:val="2"/>
-        </w:numPr>
-        <w:spacing w:after="60"/>
-      </w:pPr>
-      <w:r>
-        <w:rPr>
-          <w:b/>
-          <w:bCs/>
-        </w:rPr>
-        <w:t xml:space="preserve">Nota previa:</w:t>
-      </w:r>
-      <w:r>
-        <w:t xml:space="preserve"> falta verificar que corresponda a materias comparables.</w:t>
+          <w:sz w:val="20"/>
+          <w:szCs w:val="20"/>
+        </w:rPr>
+        <w:t xml:space="preserve">Qué se probó para mejorarlas. </w:t>
+      </w:r>
+      <w:r>
+        <w:rPr>
+          <w:sz w:val="20"/>
+          <w:szCs w:val="20"/>
+        </w:rPr>
+        <w:t xml:space="preserve">Se probaron tres variantes y ninguna mejoró de forma clara, así que se dejó el modelo como está (D-17): acercar la nota de los nodos chicos a la de su perfil EM (MAE 0,929, casi igual), promediar todos los nodos que resuenan (menos casos no monótonos, 5,2%, pero MAE 1,04 y ningún Desaprobado) y codificación con complemento de 40 bits con ρ = 0,75 (MAE 0,955 y 22% de casos no monótonos).</w:t>
       </w:r>
     </w:p>
     <w:p>

</xml_diff>